<commit_message>
Update the progress report to cover development from 15 May 2026.
Co-authored-by: Cursor <cursoragent@cursor.com>
</commit_message>
<xml_diff>
--- a/docs/NMP_Support_Ticketing_System_Progress_Report_23_September_2026.docx
+++ b/docs/NMP_Support_Ticketing_System_Progress_Report_23_September_2026.docx
@@ -229,7 +229,7 @@
           <w:sz w:val="22"/>
           <w:szCs w:val="22"/>
         </w:rPr>
-        <w:t xml:space="preserve">This letter is the official progress report for the National Museum of the Philippines (NMP) Support Ticketing System (STS) as of 23 September 2026.</w:t>
+        <w:t xml:space="preserve">This letter serves as the official progress report for the National Museum of the Philippines (NMP) Support Ticketing System as of 23 September 2026.</w:t>
       </w:r>
     </w:p>
     <w:p>
@@ -247,7 +247,7 @@
           <w:sz w:val="22"/>
           <w:szCs w:val="22"/>
         </w:rPr>
-        <w:t xml:space="preserve">System development is complete. The application now covers the Super Admin, Admin, Records, and Staff portals. Form building and publishing, request submission, client review, approval and assignment, service feedback, role-based access, messaging, reports, and the Employee User Manual (Version 2.3) are in place. The system is ready for User Acceptance Testing.</w:t>
+        <w:t xml:space="preserve">Development began on 15 May 2026 with the initial Technical Assistance Request System. That work is now delivered as the Support Ticketing System. We are pleased to report that development from 15 May 2026 through 22 September 2026 is complete, covering the Super Admin, Admin, Records, and Staff portals, the full request workflow, PAMANA employee autofill, and the Employee User Manual (Version 2.3).</w:t>
       </w:r>
     </w:p>
     <w:p>
@@ -286,7 +286,7 @@
           <w:sz w:val="22"/>
           <w:szCs w:val="22"/>
         </w:rPr>
-        <w:t xml:space="preserve">The following development items are completed:</w:t>
+        <w:t xml:space="preserve">The following milestones have been completed:</w:t>
       </w:r>
     </w:p>
     <w:tbl>
@@ -303,11 +303,11 @@
       </w:tblPr>
       <w:tblGrid>
         <w:gridCol w:w="700"/>
-        <w:gridCol w:w="3100"/>
-        <w:gridCol w:w="2100"/>
+        <w:gridCol w:w="3400"/>
+        <w:gridCol w:w="1900"/>
         <w:gridCol w:w="1100"/>
         <w:gridCol w:w="1866"/>
-        <w:gridCol w:w="1600"/>
+        <w:gridCol w:w="1500"/>
       </w:tblGrid>
       <w:tr>
         <w:trPr>
@@ -354,7 +354,7 @@
         </w:tc>
         <w:tc>
           <w:tcPr>
-            <w:tcW w:type="dxa" w:w="3100"/>
+            <w:tcW w:type="dxa" w:w="3400"/>
             <w:tcBorders>
               <w:top w:val="single" w:color="C5CDD6" w:sz="4"/>
               <w:left w:val="single" w:color="C5CDD6" w:sz="4"/>
@@ -392,7 +392,7 @@
         </w:tc>
         <w:tc>
           <w:tcPr>
-            <w:tcW w:type="dxa" w:w="2100"/>
+            <w:tcW w:type="dxa" w:w="1900"/>
             <w:tcBorders>
               <w:top w:val="single" w:color="C5CDD6" w:sz="4"/>
               <w:left w:val="single" w:color="C5CDD6" w:sz="4"/>
@@ -506,7 +506,7 @@
         </w:tc>
         <w:tc>
           <w:tcPr>
-            <w:tcW w:type="dxa" w:w="1600"/>
+            <w:tcW w:type="dxa" w:w="1500"/>
             <w:tcBorders>
               <w:top w:val="single" w:color="C5CDD6" w:sz="4"/>
               <w:left w:val="single" w:color="C5CDD6" w:sz="4"/>
@@ -586,75 +586,75 @@
         </w:tc>
         <w:tc>
           <w:tcPr>
-            <w:tcW w:type="dxa" w:w="3100"/>
-            <w:tcBorders>
-              <w:top w:val="single" w:color="C5CDD6" w:sz="4"/>
-              <w:left w:val="single" w:color="C5CDD6" w:sz="4"/>
-              <w:bottom w:val="single" w:color="C5CDD6" w:sz="4"/>
-              <w:right w:val="single" w:color="C5CDD6" w:sz="4"/>
-            </w:tcBorders>
-            <w:tcMar>
-              <w:top w:type="dxa" w:w="50"/>
-              <w:left w:type="dxa" w:w="60"/>
-              <w:bottom w:type="dxa" w:w="50"/>
-              <w:right w:type="dxa" w:w="60"/>
-            </w:tcMar>
-            <w:vAlign w:val="center"/>
-          </w:tcPr>
-          <w:p>
-            <w:pPr>
-              <w:spacing w:after="0" w:before="0"/>
-              <w:jc w:val="left"/>
-            </w:pPr>
-            <w:r>
-              <w:rPr>
-                <w:rFonts w:ascii="Calibri" w:cs="Calibri" w:eastAsia="Calibri" w:hAnsi="Calibri"/>
-                <w:b w:val="false"/>
-                <w:bCs w:val="false"/>
-                <w:i w:val="false"/>
-                <w:iCs w:val="false"/>
-                <w:color w:val="222222"/>
-                <w:sz w:val="16"/>
-                <w:szCs w:val="16"/>
-              </w:rPr>
-              <w:t xml:space="preserve">Form Builder (six steps, print placement, supporting document) and form lifecycle</w:t>
-            </w:r>
-          </w:p>
-        </w:tc>
-        <w:tc>
-          <w:tcPr>
-            <w:tcW w:type="dxa" w:w="2100"/>
-            <w:tcBorders>
-              <w:top w:val="single" w:color="C5CDD6" w:sz="4"/>
-              <w:left w:val="single" w:color="C5CDD6" w:sz="4"/>
-              <w:bottom w:val="single" w:color="C5CDD6" w:sz="4"/>
-              <w:right w:val="single" w:color="C5CDD6" w:sz="4"/>
-            </w:tcBorders>
-            <w:tcMar>
-              <w:top w:type="dxa" w:w="50"/>
-              <w:left w:type="dxa" w:w="60"/>
-              <w:bottom w:type="dxa" w:w="50"/>
-              <w:right w:type="dxa" w:w="60"/>
-            </w:tcMar>
-            <w:vAlign w:val="center"/>
-          </w:tcPr>
-          <w:p>
-            <w:pPr>
-              <w:spacing w:after="0" w:before="0"/>
-              <w:jc w:val="left"/>
-            </w:pPr>
-            <w:r>
-              <w:rPr>
-                <w:rFonts w:ascii="Calibri" w:cs="Calibri" w:eastAsia="Calibri" w:hAnsi="Calibri"/>
-                <w:b w:val="false"/>
-                <w:bCs w:val="false"/>
-                <w:i w:val="false"/>
-                <w:iCs w:val="false"/>
-                <w:color w:val="222222"/>
-                <w:sz w:val="16"/>
-                <w:szCs w:val="16"/>
-              </w:rPr>
-              <w:t xml:space="preserve">None. Delivered for UAT.</w:t>
+            <w:tcW w:type="dxa" w:w="3400"/>
+            <w:tcBorders>
+              <w:top w:val="single" w:color="C5CDD6" w:sz="4"/>
+              <w:left w:val="single" w:color="C5CDD6" w:sz="4"/>
+              <w:bottom w:val="single" w:color="C5CDD6" w:sz="4"/>
+              <w:right w:val="single" w:color="C5CDD6" w:sz="4"/>
+            </w:tcBorders>
+            <w:tcMar>
+              <w:top w:type="dxa" w:w="50"/>
+              <w:left w:type="dxa" w:w="60"/>
+              <w:bottom w:type="dxa" w:w="50"/>
+              <w:right w:type="dxa" w:w="60"/>
+            </w:tcMar>
+            <w:vAlign w:val="center"/>
+          </w:tcPr>
+          <w:p>
+            <w:pPr>
+              <w:spacing w:after="0" w:before="0"/>
+              <w:jc w:val="left"/>
+            </w:pPr>
+            <w:r>
+              <w:rPr>
+                <w:rFonts w:ascii="Calibri" w:cs="Calibri" w:eastAsia="Calibri" w:hAnsi="Calibri"/>
+                <w:b w:val="false"/>
+                <w:bCs w:val="false"/>
+                <w:i w:val="false"/>
+                <w:iCs w:val="false"/>
+                <w:color w:val="222222"/>
+                <w:sz w:val="16"/>
+                <w:szCs w:val="16"/>
+              </w:rPr>
+              <w:t xml:space="preserve">Project start: Technical Assistance Request System</w:t>
+            </w:r>
+          </w:p>
+        </w:tc>
+        <w:tc>
+          <w:tcPr>
+            <w:tcW w:type="dxa" w:w="1900"/>
+            <w:tcBorders>
+              <w:top w:val="single" w:color="C5CDD6" w:sz="4"/>
+              <w:left w:val="single" w:color="C5CDD6" w:sz="4"/>
+              <w:bottom w:val="single" w:color="C5CDD6" w:sz="4"/>
+              <w:right w:val="single" w:color="C5CDD6" w:sz="4"/>
+            </w:tcBorders>
+            <w:tcMar>
+              <w:top w:type="dxa" w:w="50"/>
+              <w:left w:type="dxa" w:w="60"/>
+              <w:bottom w:type="dxa" w:w="50"/>
+              <w:right w:type="dxa" w:w="60"/>
+            </w:tcMar>
+            <w:vAlign w:val="center"/>
+          </w:tcPr>
+          <w:p>
+            <w:pPr>
+              <w:spacing w:after="0" w:before="0"/>
+              <w:jc w:val="left"/>
+            </w:pPr>
+            <w:r>
+              <w:rPr>
+                <w:rFonts w:ascii="Calibri" w:cs="Calibri" w:eastAsia="Calibri" w:hAnsi="Calibri"/>
+                <w:b w:val="false"/>
+                <w:bCs w:val="false"/>
+                <w:i w:val="false"/>
+                <w:iCs w:val="false"/>
+                <w:color w:val="222222"/>
+                <w:sz w:val="16"/>
+                <w:szCs w:val="16"/>
+              </w:rPr>
+              <w:t xml:space="preserve">None</w:t>
             </w:r>
           </w:p>
         </w:tc>
@@ -728,13 +728,13 @@
                 <w:sz w:val="16"/>
                 <w:szCs w:val="16"/>
               </w:rPr>
-              <w:t xml:space="preserve">22 September 2026</w:t>
-            </w:r>
-          </w:p>
-        </w:tc>
-        <w:tc>
-          <w:tcPr>
-            <w:tcW w:type="dxa" w:w="1600"/>
+              <w:t xml:space="preserve">15 May 2026</w:t>
+            </w:r>
+          </w:p>
+        </w:tc>
+        <w:tc>
+          <w:tcPr>
+            <w:tcW w:type="dxa" w:w="1500"/>
             <w:tcBorders>
               <w:top w:val="single" w:color="C5CDD6" w:sz="4"/>
               <w:left w:val="single" w:color="C5CDD6" w:sz="4"/>
@@ -813,75 +813,75 @@
         </w:tc>
         <w:tc>
           <w:tcPr>
-            <w:tcW w:type="dxa" w:w="3100"/>
-            <w:tcBorders>
-              <w:top w:val="single" w:color="C5CDD6" w:sz="4"/>
-              <w:left w:val="single" w:color="C5CDD6" w:sz="4"/>
-              <w:bottom w:val="single" w:color="C5CDD6" w:sz="4"/>
-              <w:right w:val="single" w:color="C5CDD6" w:sz="4"/>
-            </w:tcBorders>
-            <w:tcMar>
-              <w:top w:type="dxa" w:w="50"/>
-              <w:left w:type="dxa" w:w="60"/>
-              <w:bottom w:type="dxa" w:w="50"/>
-              <w:right w:type="dxa" w:w="60"/>
-            </w:tcMar>
-            <w:vAlign w:val="center"/>
-          </w:tcPr>
-          <w:p>
-            <w:pPr>
-              <w:spacing w:after="0" w:before="0"/>
-              <w:jc w:val="left"/>
-            </w:pPr>
-            <w:r>
-              <w:rPr>
-                <w:rFonts w:ascii="Calibri" w:cs="Calibri" w:eastAsia="Calibri" w:hAnsi="Calibri"/>
-                <w:b w:val="false"/>
-                <w:bCs w:val="false"/>
-                <w:i w:val="false"/>
-                <w:iCs w:val="false"/>
-                <w:color w:val="222222"/>
-                <w:sz w:val="16"/>
-                <w:szCs w:val="16"/>
-              </w:rPr>
-              <w:t xml:space="preserve">Records review and publishing (Pending Forms, Published Forms, recommendation)</w:t>
-            </w:r>
-          </w:p>
-        </w:tc>
-        <w:tc>
-          <w:tcPr>
-            <w:tcW w:type="dxa" w:w="2100"/>
-            <w:tcBorders>
-              <w:top w:val="single" w:color="C5CDD6" w:sz="4"/>
-              <w:left w:val="single" w:color="C5CDD6" w:sz="4"/>
-              <w:bottom w:val="single" w:color="C5CDD6" w:sz="4"/>
-              <w:right w:val="single" w:color="C5CDD6" w:sz="4"/>
-            </w:tcBorders>
-            <w:tcMar>
-              <w:top w:type="dxa" w:w="50"/>
-              <w:left w:type="dxa" w:w="60"/>
-              <w:bottom w:type="dxa" w:w="50"/>
-              <w:right w:type="dxa" w:w="60"/>
-            </w:tcMar>
-            <w:vAlign w:val="center"/>
-          </w:tcPr>
-          <w:p>
-            <w:pPr>
-              <w:spacing w:after="0" w:before="0"/>
-              <w:jc w:val="left"/>
-            </w:pPr>
-            <w:r>
-              <w:rPr>
-                <w:rFonts w:ascii="Calibri" w:cs="Calibri" w:eastAsia="Calibri" w:hAnsi="Calibri"/>
-                <w:b w:val="false"/>
-                <w:bCs w:val="false"/>
-                <w:i w:val="false"/>
-                <w:iCs w:val="false"/>
-                <w:color w:val="222222"/>
-                <w:sz w:val="16"/>
-                <w:szCs w:val="16"/>
-              </w:rPr>
-              <w:t xml:space="preserve">None. Delivered for UAT.</w:t>
+            <w:tcW w:type="dxa" w:w="3400"/>
+            <w:tcBorders>
+              <w:top w:val="single" w:color="C5CDD6" w:sz="4"/>
+              <w:left w:val="single" w:color="C5CDD6" w:sz="4"/>
+              <w:bottom w:val="single" w:color="C5CDD6" w:sz="4"/>
+              <w:right w:val="single" w:color="C5CDD6" w:sz="4"/>
+            </w:tcBorders>
+            <w:tcMar>
+              <w:top w:type="dxa" w:w="50"/>
+              <w:left w:type="dxa" w:w="60"/>
+              <w:bottom w:type="dxa" w:w="50"/>
+              <w:right w:type="dxa" w:w="60"/>
+            </w:tcMar>
+            <w:vAlign w:val="center"/>
+          </w:tcPr>
+          <w:p>
+            <w:pPr>
+              <w:spacing w:after="0" w:before="0"/>
+              <w:jc w:val="left"/>
+            </w:pPr>
+            <w:r>
+              <w:rPr>
+                <w:rFonts w:ascii="Calibri" w:cs="Calibri" w:eastAsia="Calibri" w:hAnsi="Calibri"/>
+                <w:b w:val="false"/>
+                <w:bCs w:val="false"/>
+                <w:i w:val="false"/>
+                <w:iCs w:val="false"/>
+                <w:color w:val="222222"/>
+                <w:sz w:val="16"/>
+                <w:szCs w:val="16"/>
+              </w:rPr>
+              <w:t xml:space="preserve">Admin, Records, and Client portals, and the core request workflow</w:t>
+            </w:r>
+          </w:p>
+        </w:tc>
+        <w:tc>
+          <w:tcPr>
+            <w:tcW w:type="dxa" w:w="1900"/>
+            <w:tcBorders>
+              <w:top w:val="single" w:color="C5CDD6" w:sz="4"/>
+              <w:left w:val="single" w:color="C5CDD6" w:sz="4"/>
+              <w:bottom w:val="single" w:color="C5CDD6" w:sz="4"/>
+              <w:right w:val="single" w:color="C5CDD6" w:sz="4"/>
+            </w:tcBorders>
+            <w:tcMar>
+              <w:top w:type="dxa" w:w="50"/>
+              <w:left w:type="dxa" w:w="60"/>
+              <w:bottom w:type="dxa" w:w="50"/>
+              <w:right w:type="dxa" w:w="60"/>
+            </w:tcMar>
+            <w:vAlign w:val="center"/>
+          </w:tcPr>
+          <w:p>
+            <w:pPr>
+              <w:spacing w:after="0" w:before="0"/>
+              <w:jc w:val="left"/>
+            </w:pPr>
+            <w:r>
+              <w:rPr>
+                <w:rFonts w:ascii="Calibri" w:cs="Calibri" w:eastAsia="Calibri" w:hAnsi="Calibri"/>
+                <w:b w:val="false"/>
+                <w:bCs w:val="false"/>
+                <w:i w:val="false"/>
+                <w:iCs w:val="false"/>
+                <w:color w:val="222222"/>
+                <w:sz w:val="16"/>
+                <w:szCs w:val="16"/>
+              </w:rPr>
+              <w:t xml:space="preserve">None</w:t>
             </w:r>
           </w:p>
         </w:tc>
@@ -955,13 +955,13 @@
                 <w:sz w:val="16"/>
                 <w:szCs w:val="16"/>
               </w:rPr>
-              <w:t xml:space="preserve">22 September 2026</w:t>
-            </w:r>
-          </w:p>
-        </w:tc>
-        <w:tc>
-          <w:tcPr>
-            <w:tcW w:type="dxa" w:w="1600"/>
+              <w:t xml:space="preserve">30 June 2026</w:t>
+            </w:r>
+          </w:p>
+        </w:tc>
+        <w:tc>
+          <w:tcPr>
+            <w:tcW w:type="dxa" w:w="1500"/>
             <w:tcBorders>
               <w:top w:val="single" w:color="C5CDD6" w:sz="4"/>
               <w:left w:val="single" w:color="C5CDD6" w:sz="4"/>
@@ -1040,75 +1040,75 @@
         </w:tc>
         <w:tc>
           <w:tcPr>
-            <w:tcW w:type="dxa" w:w="3100"/>
-            <w:tcBorders>
-              <w:top w:val="single" w:color="C5CDD6" w:sz="4"/>
-              <w:left w:val="single" w:color="C5CDD6" w:sz="4"/>
-              <w:bottom w:val="single" w:color="C5CDD6" w:sz="4"/>
-              <w:right w:val="single" w:color="C5CDD6" w:sz="4"/>
-            </w:tcBorders>
-            <w:tcMar>
-              <w:top w:type="dxa" w:w="50"/>
-              <w:left w:type="dxa" w:w="60"/>
-              <w:bottom w:type="dxa" w:w="50"/>
-              <w:right w:type="dxa" w:w="60"/>
-            </w:tcMar>
-            <w:vAlign w:val="center"/>
-          </w:tcPr>
-          <w:p>
-            <w:pPr>
-              <w:spacing w:after="0" w:before="0"/>
-              <w:jc w:val="left"/>
-            </w:pPr>
-            <w:r>
-              <w:rPr>
-                <w:rFonts w:ascii="Calibri" w:cs="Calibri" w:eastAsia="Calibri" w:hAnsi="Calibri"/>
-                <w:b w:val="false"/>
-                <w:bCs w:val="false"/>
-                <w:i w:val="false"/>
-                <w:iCs w:val="false"/>
-                <w:color w:val="222222"/>
-                <w:sz w:val="16"/>
-                <w:szCs w:val="16"/>
-              </w:rPr>
-              <w:t xml:space="preserve">Staff request workflow (submit, For Review, approvals, assignment, feedback, close)</w:t>
-            </w:r>
-          </w:p>
-        </w:tc>
-        <w:tc>
-          <w:tcPr>
-            <w:tcW w:type="dxa" w:w="2100"/>
-            <w:tcBorders>
-              <w:top w:val="single" w:color="C5CDD6" w:sz="4"/>
-              <w:left w:val="single" w:color="C5CDD6" w:sz="4"/>
-              <w:bottom w:val="single" w:color="C5CDD6" w:sz="4"/>
-              <w:right w:val="single" w:color="C5CDD6" w:sz="4"/>
-            </w:tcBorders>
-            <w:tcMar>
-              <w:top w:type="dxa" w:w="50"/>
-              <w:left w:type="dxa" w:w="60"/>
-              <w:bottom w:type="dxa" w:w="50"/>
-              <w:right w:type="dxa" w:w="60"/>
-            </w:tcMar>
-            <w:vAlign w:val="center"/>
-          </w:tcPr>
-          <w:p>
-            <w:pPr>
-              <w:spacing w:after="0" w:before="0"/>
-              <w:jc w:val="left"/>
-            </w:pPr>
-            <w:r>
-              <w:rPr>
-                <w:rFonts w:ascii="Calibri" w:cs="Calibri" w:eastAsia="Calibri" w:hAnsi="Calibri"/>
-                <w:b w:val="false"/>
-                <w:bCs w:val="false"/>
-                <w:i w:val="false"/>
-                <w:iCs w:val="false"/>
-                <w:color w:val="222222"/>
-                <w:sz w:val="16"/>
-                <w:szCs w:val="16"/>
-              </w:rPr>
-              <w:t xml:space="preserve">None. Delivered for UAT.</w:t>
+            <w:tcW w:type="dxa" w:w="3400"/>
+            <w:tcBorders>
+              <w:top w:val="single" w:color="C5CDD6" w:sz="4"/>
+              <w:left w:val="single" w:color="C5CDD6" w:sz="4"/>
+              <w:bottom w:val="single" w:color="C5CDD6" w:sz="4"/>
+              <w:right w:val="single" w:color="C5CDD6" w:sz="4"/>
+            </w:tcBorders>
+            <w:tcMar>
+              <w:top w:type="dxa" w:w="50"/>
+              <w:left w:type="dxa" w:w="60"/>
+              <w:bottom w:type="dxa" w:w="50"/>
+              <w:right w:type="dxa" w:w="60"/>
+            </w:tcMar>
+            <w:vAlign w:val="center"/>
+          </w:tcPr>
+          <w:p>
+            <w:pPr>
+              <w:spacing w:after="0" w:before="0"/>
+              <w:jc w:val="left"/>
+            </w:pPr>
+            <w:r>
+              <w:rPr>
+                <w:rFonts w:ascii="Calibri" w:cs="Calibri" w:eastAsia="Calibri" w:hAnsi="Calibri"/>
+                <w:b w:val="false"/>
+                <w:bCs w:val="false"/>
+                <w:i w:val="false"/>
+                <w:iCs w:val="false"/>
+                <w:color w:val="222222"/>
+                <w:sz w:val="16"/>
+                <w:szCs w:val="16"/>
+              </w:rPr>
+              <w:t xml:space="preserve">Real-time messaging, dashboards, and Settings</w:t>
+            </w:r>
+          </w:p>
+        </w:tc>
+        <w:tc>
+          <w:tcPr>
+            <w:tcW w:type="dxa" w:w="1900"/>
+            <w:tcBorders>
+              <w:top w:val="single" w:color="C5CDD6" w:sz="4"/>
+              <w:left w:val="single" w:color="C5CDD6" w:sz="4"/>
+              <w:bottom w:val="single" w:color="C5CDD6" w:sz="4"/>
+              <w:right w:val="single" w:color="C5CDD6" w:sz="4"/>
+            </w:tcBorders>
+            <w:tcMar>
+              <w:top w:type="dxa" w:w="50"/>
+              <w:left w:type="dxa" w:w="60"/>
+              <w:bottom w:type="dxa" w:w="50"/>
+              <w:right w:type="dxa" w:w="60"/>
+            </w:tcMar>
+            <w:vAlign w:val="center"/>
+          </w:tcPr>
+          <w:p>
+            <w:pPr>
+              <w:spacing w:after="0" w:before="0"/>
+              <w:jc w:val="left"/>
+            </w:pPr>
+            <w:r>
+              <w:rPr>
+                <w:rFonts w:ascii="Calibri" w:cs="Calibri" w:eastAsia="Calibri" w:hAnsi="Calibri"/>
+                <w:b w:val="false"/>
+                <w:bCs w:val="false"/>
+                <w:i w:val="false"/>
+                <w:iCs w:val="false"/>
+                <w:color w:val="222222"/>
+                <w:sz w:val="16"/>
+                <w:szCs w:val="16"/>
+              </w:rPr>
+              <w:t xml:space="preserve">None</w:t>
             </w:r>
           </w:p>
         </w:tc>
@@ -1182,13 +1182,13 @@
                 <w:sz w:val="16"/>
                 <w:szCs w:val="16"/>
               </w:rPr>
-              <w:t xml:space="preserve">22 September 2026</w:t>
-            </w:r>
-          </w:p>
-        </w:tc>
-        <w:tc>
-          <w:tcPr>
-            <w:tcW w:type="dxa" w:w="1600"/>
+              <w:t xml:space="preserve">28 July 2026</w:t>
+            </w:r>
+          </w:p>
+        </w:tc>
+        <w:tc>
+          <w:tcPr>
+            <w:tcW w:type="dxa" w:w="1500"/>
             <w:tcBorders>
               <w:top w:val="single" w:color="C5CDD6" w:sz="4"/>
               <w:left w:val="single" w:color="C5CDD6" w:sz="4"/>
@@ -1267,75 +1267,75 @@
         </w:tc>
         <w:tc>
           <w:tcPr>
-            <w:tcW w:type="dxa" w:w="3100"/>
-            <w:tcBorders>
-              <w:top w:val="single" w:color="C5CDD6" w:sz="4"/>
-              <w:left w:val="single" w:color="C5CDD6" w:sz="4"/>
-              <w:bottom w:val="single" w:color="C5CDD6" w:sz="4"/>
-              <w:right w:val="single" w:color="C5CDD6" w:sz="4"/>
-            </w:tcBorders>
-            <w:tcMar>
-              <w:top w:type="dxa" w:w="50"/>
-              <w:left w:type="dxa" w:w="60"/>
-              <w:bottom w:type="dxa" w:w="50"/>
-              <w:right w:type="dxa" w:w="60"/>
-            </w:tcMar>
-            <w:vAlign w:val="center"/>
-          </w:tcPr>
-          <w:p>
-            <w:pPr>
-              <w:spacing w:after="0" w:before="0"/>
-              <w:jc w:val="left"/>
-            </w:pPr>
-            <w:r>
-              <w:rPr>
-                <w:rFonts w:ascii="Calibri" w:cs="Calibri" w:eastAsia="Calibri" w:hAnsi="Calibri"/>
-                <w:b w:val="false"/>
-                <w:bCs w:val="false"/>
-                <w:i w:val="false"/>
-                <w:iCs w:val="false"/>
-                <w:color w:val="222222"/>
-                <w:sz w:val="16"/>
-                <w:szCs w:val="16"/>
-              </w:rPr>
-              <w:t xml:space="preserve">PAMANA employee autofill, users, roles, and permissions</w:t>
-            </w:r>
-          </w:p>
-        </w:tc>
-        <w:tc>
-          <w:tcPr>
-            <w:tcW w:type="dxa" w:w="2100"/>
-            <w:tcBorders>
-              <w:top w:val="single" w:color="C5CDD6" w:sz="4"/>
-              <w:left w:val="single" w:color="C5CDD6" w:sz="4"/>
-              <w:bottom w:val="single" w:color="C5CDD6" w:sz="4"/>
-              <w:right w:val="single" w:color="C5CDD6" w:sz="4"/>
-            </w:tcBorders>
-            <w:tcMar>
-              <w:top w:type="dxa" w:w="50"/>
-              <w:left w:type="dxa" w:w="60"/>
-              <w:bottom w:type="dxa" w:w="50"/>
-              <w:right w:type="dxa" w:w="60"/>
-            </w:tcMar>
-            <w:vAlign w:val="center"/>
-          </w:tcPr>
-          <w:p>
-            <w:pPr>
-              <w:spacing w:after="0" w:before="0"/>
-              <w:jc w:val="left"/>
-            </w:pPr>
-            <w:r>
-              <w:rPr>
-                <w:rFonts w:ascii="Calibri" w:cs="Calibri" w:eastAsia="Calibri" w:hAnsi="Calibri"/>
-                <w:b w:val="false"/>
-                <w:bCs w:val="false"/>
-                <w:i w:val="false"/>
-                <w:iCs w:val="false"/>
-                <w:color w:val="222222"/>
-                <w:sz w:val="16"/>
-                <w:szCs w:val="16"/>
-              </w:rPr>
-              <w:t xml:space="preserve">None. Delivered for UAT.</w:t>
+            <w:tcW w:type="dxa" w:w="3400"/>
+            <w:tcBorders>
+              <w:top w:val="single" w:color="C5CDD6" w:sz="4"/>
+              <w:left w:val="single" w:color="C5CDD6" w:sz="4"/>
+              <w:bottom w:val="single" w:color="C5CDD6" w:sz="4"/>
+              <w:right w:val="single" w:color="C5CDD6" w:sz="4"/>
+            </w:tcBorders>
+            <w:tcMar>
+              <w:top w:type="dxa" w:w="50"/>
+              <w:left w:type="dxa" w:w="60"/>
+              <w:bottom w:type="dxa" w:w="50"/>
+              <w:right w:type="dxa" w:w="60"/>
+            </w:tcMar>
+            <w:vAlign w:val="center"/>
+          </w:tcPr>
+          <w:p>
+            <w:pPr>
+              <w:spacing w:after="0" w:before="0"/>
+              <w:jc w:val="left"/>
+            </w:pPr>
+            <w:r>
+              <w:rPr>
+                <w:rFonts w:ascii="Calibri" w:cs="Calibri" w:eastAsia="Calibri" w:hAnsi="Calibri"/>
+                <w:b w:val="false"/>
+                <w:bCs w:val="false"/>
+                <w:i w:val="false"/>
+                <w:iCs w:val="false"/>
+                <w:color w:val="222222"/>
+                <w:sz w:val="16"/>
+                <w:szCs w:val="16"/>
+              </w:rPr>
+              <w:t xml:space="preserve">Migration to Laravel and MySQL</w:t>
+            </w:r>
+          </w:p>
+        </w:tc>
+        <w:tc>
+          <w:tcPr>
+            <w:tcW w:type="dxa" w:w="1900"/>
+            <w:tcBorders>
+              <w:top w:val="single" w:color="C5CDD6" w:sz="4"/>
+              <w:left w:val="single" w:color="C5CDD6" w:sz="4"/>
+              <w:bottom w:val="single" w:color="C5CDD6" w:sz="4"/>
+              <w:right w:val="single" w:color="C5CDD6" w:sz="4"/>
+            </w:tcBorders>
+            <w:tcMar>
+              <w:top w:type="dxa" w:w="50"/>
+              <w:left w:type="dxa" w:w="60"/>
+              <w:bottom w:type="dxa" w:w="50"/>
+              <w:right w:type="dxa" w:w="60"/>
+            </w:tcMar>
+            <w:vAlign w:val="center"/>
+          </w:tcPr>
+          <w:p>
+            <w:pPr>
+              <w:spacing w:after="0" w:before="0"/>
+              <w:jc w:val="left"/>
+            </w:pPr>
+            <w:r>
+              <w:rPr>
+                <w:rFonts w:ascii="Calibri" w:cs="Calibri" w:eastAsia="Calibri" w:hAnsi="Calibri"/>
+                <w:b w:val="false"/>
+                <w:bCs w:val="false"/>
+                <w:i w:val="false"/>
+                <w:iCs w:val="false"/>
+                <w:color w:val="222222"/>
+                <w:sz w:val="16"/>
+                <w:szCs w:val="16"/>
+              </w:rPr>
+              <w:t xml:space="preserve">None</w:t>
             </w:r>
           </w:p>
         </w:tc>
@@ -1409,13 +1409,13 @@
                 <w:sz w:val="16"/>
                 <w:szCs w:val="16"/>
               </w:rPr>
-              <w:t xml:space="preserve">22 September 2026</w:t>
-            </w:r>
-          </w:p>
-        </w:tc>
-        <w:tc>
-          <w:tcPr>
-            <w:tcW w:type="dxa" w:w="1600"/>
+              <w:t xml:space="preserve">26 August 2026</w:t>
+            </w:r>
+          </w:p>
+        </w:tc>
+        <w:tc>
+          <w:tcPr>
+            <w:tcW w:type="dxa" w:w="1500"/>
             <w:tcBorders>
               <w:top w:val="single" w:color="C5CDD6" w:sz="4"/>
               <w:left w:val="single" w:color="C5CDD6" w:sz="4"/>
@@ -1494,7 +1494,461 @@
         </w:tc>
         <w:tc>
           <w:tcPr>
-            <w:tcW w:type="dxa" w:w="3100"/>
+            <w:tcW w:type="dxa" w:w="3400"/>
+            <w:tcBorders>
+              <w:top w:val="single" w:color="C5CDD6" w:sz="4"/>
+              <w:left w:val="single" w:color="C5CDD6" w:sz="4"/>
+              <w:bottom w:val="single" w:color="C5CDD6" w:sz="4"/>
+              <w:right w:val="single" w:color="C5CDD6" w:sz="4"/>
+            </w:tcBorders>
+            <w:tcMar>
+              <w:top w:type="dxa" w:w="50"/>
+              <w:left w:type="dxa" w:w="60"/>
+              <w:bottom w:type="dxa" w:w="50"/>
+              <w:right w:type="dxa" w:w="60"/>
+            </w:tcMar>
+            <w:vAlign w:val="center"/>
+          </w:tcPr>
+          <w:p>
+            <w:pPr>
+              <w:spacing w:after="0" w:before="0"/>
+              <w:jc w:val="left"/>
+            </w:pPr>
+            <w:r>
+              <w:rPr>
+                <w:rFonts w:ascii="Calibri" w:cs="Calibri" w:eastAsia="Calibri" w:hAnsi="Calibri"/>
+                <w:b w:val="false"/>
+                <w:bCs w:val="false"/>
+                <w:i w:val="false"/>
+                <w:iCs w:val="false"/>
+                <w:color w:val="222222"/>
+                <w:sz w:val="16"/>
+                <w:szCs w:val="16"/>
+              </w:rPr>
+              <w:t xml:space="preserve">PAMANA autofill, Super Admin portal, and role-based access</w:t>
+            </w:r>
+          </w:p>
+        </w:tc>
+        <w:tc>
+          <w:tcPr>
+            <w:tcW w:type="dxa" w:w="1900"/>
+            <w:tcBorders>
+              <w:top w:val="single" w:color="C5CDD6" w:sz="4"/>
+              <w:left w:val="single" w:color="C5CDD6" w:sz="4"/>
+              <w:bottom w:val="single" w:color="C5CDD6" w:sz="4"/>
+              <w:right w:val="single" w:color="C5CDD6" w:sz="4"/>
+            </w:tcBorders>
+            <w:tcMar>
+              <w:top w:type="dxa" w:w="50"/>
+              <w:left w:type="dxa" w:w="60"/>
+              <w:bottom w:type="dxa" w:w="50"/>
+              <w:right w:type="dxa" w:w="60"/>
+            </w:tcMar>
+            <w:vAlign w:val="center"/>
+          </w:tcPr>
+          <w:p>
+            <w:pPr>
+              <w:spacing w:after="0" w:before="0"/>
+              <w:jc w:val="left"/>
+            </w:pPr>
+            <w:r>
+              <w:rPr>
+                <w:rFonts w:ascii="Calibri" w:cs="Calibri" w:eastAsia="Calibri" w:hAnsi="Calibri"/>
+                <w:b w:val="false"/>
+                <w:bCs w:val="false"/>
+                <w:i w:val="false"/>
+                <w:iCs w:val="false"/>
+                <w:color w:val="222222"/>
+                <w:sz w:val="16"/>
+                <w:szCs w:val="16"/>
+              </w:rPr>
+              <w:t xml:space="preserve">None</w:t>
+            </w:r>
+          </w:p>
+        </w:tc>
+        <w:tc>
+          <w:tcPr>
+            <w:tcW w:type="dxa" w:w="1100"/>
+            <w:tcBorders>
+              <w:top w:val="single" w:color="C5CDD6" w:sz="4"/>
+              <w:left w:val="single" w:color="C5CDD6" w:sz="4"/>
+              <w:bottom w:val="single" w:color="C5CDD6" w:sz="4"/>
+              <w:right w:val="single" w:color="C5CDD6" w:sz="4"/>
+            </w:tcBorders>
+            <w:tcMar>
+              <w:top w:type="dxa" w:w="50"/>
+              <w:left w:type="dxa" w:w="60"/>
+              <w:bottom w:type="dxa" w:w="50"/>
+              <w:right w:type="dxa" w:w="60"/>
+            </w:tcMar>
+            <w:vAlign w:val="center"/>
+          </w:tcPr>
+          <w:p>
+            <w:pPr>
+              <w:spacing w:after="0" w:before="0"/>
+              <w:jc w:val="left"/>
+            </w:pPr>
+            <w:r>
+              <w:rPr>
+                <w:rFonts w:ascii="Calibri" w:cs="Calibri" w:eastAsia="Calibri" w:hAnsi="Calibri"/>
+                <w:b w:val="false"/>
+                <w:bCs w:val="false"/>
+                <w:i w:val="false"/>
+                <w:iCs w:val="false"/>
+                <w:color w:val="222222"/>
+                <w:sz w:val="16"/>
+                <w:szCs w:val="16"/>
+              </w:rPr>
+              <w:t xml:space="preserve">DVC</w:t>
+            </w:r>
+          </w:p>
+        </w:tc>
+        <w:tc>
+          <w:tcPr>
+            <w:tcW w:type="dxa" w:w="1866"/>
+            <w:tcBorders>
+              <w:top w:val="single" w:color="C5CDD6" w:sz="4"/>
+              <w:left w:val="single" w:color="C5CDD6" w:sz="4"/>
+              <w:bottom w:val="single" w:color="C5CDD6" w:sz="4"/>
+              <w:right w:val="single" w:color="C5CDD6" w:sz="4"/>
+            </w:tcBorders>
+            <w:tcMar>
+              <w:top w:type="dxa" w:w="50"/>
+              <w:left w:type="dxa" w:w="60"/>
+              <w:bottom w:type="dxa" w:w="50"/>
+              <w:right w:type="dxa" w:w="60"/>
+            </w:tcMar>
+            <w:vAlign w:val="center"/>
+          </w:tcPr>
+          <w:p>
+            <w:pPr>
+              <w:spacing w:after="0" w:before="0"/>
+              <w:jc w:val="left"/>
+            </w:pPr>
+            <w:r>
+              <w:rPr>
+                <w:rFonts w:ascii="Calibri" w:cs="Calibri" w:eastAsia="Calibri" w:hAnsi="Calibri"/>
+                <w:b w:val="false"/>
+                <w:bCs w:val="false"/>
+                <w:i w:val="false"/>
+                <w:iCs w:val="false"/>
+                <w:color w:val="222222"/>
+                <w:sz w:val="16"/>
+                <w:szCs w:val="16"/>
+              </w:rPr>
+              <w:t xml:space="preserve">3 September 2026</w:t>
+            </w:r>
+          </w:p>
+        </w:tc>
+        <w:tc>
+          <w:tcPr>
+            <w:tcW w:type="dxa" w:w="1500"/>
+            <w:tcBorders>
+              <w:top w:val="single" w:color="C5CDD6" w:sz="4"/>
+              <w:left w:val="single" w:color="C5CDD6" w:sz="4"/>
+              <w:bottom w:val="single" w:color="C5CDD6" w:sz="4"/>
+              <w:right w:val="single" w:color="C5CDD6" w:sz="4"/>
+            </w:tcBorders>
+            <w:tcMar>
+              <w:top w:type="dxa" w:w="50"/>
+              <w:left w:type="dxa" w:w="60"/>
+              <w:bottom w:type="dxa" w:w="50"/>
+              <w:right w:type="dxa" w:w="60"/>
+            </w:tcMar>
+            <w:vAlign w:val="center"/>
+          </w:tcPr>
+          <w:p>
+            <w:pPr>
+              <w:spacing w:after="0" w:before="0"/>
+              <w:jc w:val="left"/>
+            </w:pPr>
+            <w:r>
+              <w:rPr>
+                <w:rFonts w:ascii="Calibri" w:cs="Calibri" w:eastAsia="Calibri" w:hAnsi="Calibri"/>
+                <w:b w:val="false"/>
+                <w:bCs w:val="false"/>
+                <w:i w:val="false"/>
+                <w:iCs w:val="false"/>
+                <w:color w:val="222222"/>
+                <w:sz w:val="16"/>
+                <w:szCs w:val="16"/>
+              </w:rPr>
+              <w:t xml:space="preserve">Completed</w:t>
+            </w:r>
+          </w:p>
+        </w:tc>
+      </w:tr>
+      <w:tr>
+        <w:trPr>
+          <w:cantSplit/>
+        </w:trPr>
+        <w:tc>
+          <w:tcPr>
+            <w:tcW w:type="dxa" w:w="700"/>
+            <w:tcBorders>
+              <w:top w:val="single" w:color="C5CDD6" w:sz="4"/>
+              <w:left w:val="single" w:color="C5CDD6" w:sz="4"/>
+              <w:bottom w:val="single" w:color="C5CDD6" w:sz="4"/>
+              <w:right w:val="single" w:color="C5CDD6" w:sz="4"/>
+            </w:tcBorders>
+            <w:tcMar>
+              <w:top w:type="dxa" w:w="50"/>
+              <w:left w:type="dxa" w:w="60"/>
+              <w:bottom w:type="dxa" w:w="50"/>
+              <w:right w:type="dxa" w:w="60"/>
+            </w:tcMar>
+            <w:vAlign w:val="center"/>
+          </w:tcPr>
+          <w:p>
+            <w:pPr>
+              <w:spacing w:after="0" w:before="0"/>
+              <w:jc w:val="left"/>
+            </w:pPr>
+            <w:r>
+              <w:rPr>
+                <w:rFonts w:ascii="Calibri" w:cs="Calibri" w:eastAsia="Calibri" w:hAnsi="Calibri"/>
+                <w:b w:val="false"/>
+                <w:bCs w:val="false"/>
+                <w:i w:val="false"/>
+                <w:iCs w:val="false"/>
+                <w:color w:val="222222"/>
+                <w:sz w:val="16"/>
+                <w:szCs w:val="16"/>
+              </w:rPr>
+              <w:t xml:space="preserve">6</w:t>
+            </w:r>
+          </w:p>
+        </w:tc>
+        <w:tc>
+          <w:tcPr>
+            <w:tcW w:type="dxa" w:w="3400"/>
+            <w:tcBorders>
+              <w:top w:val="single" w:color="C5CDD6" w:sz="4"/>
+              <w:left w:val="single" w:color="C5CDD6" w:sz="4"/>
+              <w:bottom w:val="single" w:color="C5CDD6" w:sz="4"/>
+              <w:right w:val="single" w:color="C5CDD6" w:sz="4"/>
+            </w:tcBorders>
+            <w:tcMar>
+              <w:top w:type="dxa" w:w="50"/>
+              <w:left w:type="dxa" w:w="60"/>
+              <w:bottom w:type="dxa" w:w="50"/>
+              <w:right w:type="dxa" w:w="60"/>
+            </w:tcMar>
+            <w:vAlign w:val="center"/>
+          </w:tcPr>
+          <w:p>
+            <w:pPr>
+              <w:spacing w:after="0" w:before="0"/>
+              <w:jc w:val="left"/>
+            </w:pPr>
+            <w:r>
+              <w:rPr>
+                <w:rFonts w:ascii="Calibri" w:cs="Calibri" w:eastAsia="Calibri" w:hAnsi="Calibri"/>
+                <w:b w:val="false"/>
+                <w:bCs w:val="false"/>
+                <w:i w:val="false"/>
+                <w:iCs w:val="false"/>
+                <w:color w:val="222222"/>
+                <w:sz w:val="16"/>
+                <w:szCs w:val="16"/>
+              </w:rPr>
+              <w:t xml:space="preserve">Client review queues, Assigned to me, and section personnel lists</w:t>
+            </w:r>
+          </w:p>
+        </w:tc>
+        <w:tc>
+          <w:tcPr>
+            <w:tcW w:type="dxa" w:w="1900"/>
+            <w:tcBorders>
+              <w:top w:val="single" w:color="C5CDD6" w:sz="4"/>
+              <w:left w:val="single" w:color="C5CDD6" w:sz="4"/>
+              <w:bottom w:val="single" w:color="C5CDD6" w:sz="4"/>
+              <w:right w:val="single" w:color="C5CDD6" w:sz="4"/>
+            </w:tcBorders>
+            <w:tcMar>
+              <w:top w:type="dxa" w:w="50"/>
+              <w:left w:type="dxa" w:w="60"/>
+              <w:bottom w:type="dxa" w:w="50"/>
+              <w:right w:type="dxa" w:w="60"/>
+            </w:tcMar>
+            <w:vAlign w:val="center"/>
+          </w:tcPr>
+          <w:p>
+            <w:pPr>
+              <w:spacing w:after="0" w:before="0"/>
+              <w:jc w:val="left"/>
+            </w:pPr>
+            <w:r>
+              <w:rPr>
+                <w:rFonts w:ascii="Calibri" w:cs="Calibri" w:eastAsia="Calibri" w:hAnsi="Calibri"/>
+                <w:b w:val="false"/>
+                <w:bCs w:val="false"/>
+                <w:i w:val="false"/>
+                <w:iCs w:val="false"/>
+                <w:color w:val="222222"/>
+                <w:sz w:val="16"/>
+                <w:szCs w:val="16"/>
+              </w:rPr>
+              <w:t xml:space="preserve">None</w:t>
+            </w:r>
+          </w:p>
+        </w:tc>
+        <w:tc>
+          <w:tcPr>
+            <w:tcW w:type="dxa" w:w="1100"/>
+            <w:tcBorders>
+              <w:top w:val="single" w:color="C5CDD6" w:sz="4"/>
+              <w:left w:val="single" w:color="C5CDD6" w:sz="4"/>
+              <w:bottom w:val="single" w:color="C5CDD6" w:sz="4"/>
+              <w:right w:val="single" w:color="C5CDD6" w:sz="4"/>
+            </w:tcBorders>
+            <w:tcMar>
+              <w:top w:type="dxa" w:w="50"/>
+              <w:left w:type="dxa" w:w="60"/>
+              <w:bottom w:type="dxa" w:w="50"/>
+              <w:right w:type="dxa" w:w="60"/>
+            </w:tcMar>
+            <w:vAlign w:val="center"/>
+          </w:tcPr>
+          <w:p>
+            <w:pPr>
+              <w:spacing w:after="0" w:before="0"/>
+              <w:jc w:val="left"/>
+            </w:pPr>
+            <w:r>
+              <w:rPr>
+                <w:rFonts w:ascii="Calibri" w:cs="Calibri" w:eastAsia="Calibri" w:hAnsi="Calibri"/>
+                <w:b w:val="false"/>
+                <w:bCs w:val="false"/>
+                <w:i w:val="false"/>
+                <w:iCs w:val="false"/>
+                <w:color w:val="222222"/>
+                <w:sz w:val="16"/>
+                <w:szCs w:val="16"/>
+              </w:rPr>
+              <w:t xml:space="preserve">DVC</w:t>
+            </w:r>
+          </w:p>
+        </w:tc>
+        <w:tc>
+          <w:tcPr>
+            <w:tcW w:type="dxa" w:w="1866"/>
+            <w:tcBorders>
+              <w:top w:val="single" w:color="C5CDD6" w:sz="4"/>
+              <w:left w:val="single" w:color="C5CDD6" w:sz="4"/>
+              <w:bottom w:val="single" w:color="C5CDD6" w:sz="4"/>
+              <w:right w:val="single" w:color="C5CDD6" w:sz="4"/>
+            </w:tcBorders>
+            <w:tcMar>
+              <w:top w:type="dxa" w:w="50"/>
+              <w:left w:type="dxa" w:w="60"/>
+              <w:bottom w:type="dxa" w:w="50"/>
+              <w:right w:type="dxa" w:w="60"/>
+            </w:tcMar>
+            <w:vAlign w:val="center"/>
+          </w:tcPr>
+          <w:p>
+            <w:pPr>
+              <w:spacing w:after="0" w:before="0"/>
+              <w:jc w:val="left"/>
+            </w:pPr>
+            <w:r>
+              <w:rPr>
+                <w:rFonts w:ascii="Calibri" w:cs="Calibri" w:eastAsia="Calibri" w:hAnsi="Calibri"/>
+                <w:b w:val="false"/>
+                <w:bCs w:val="false"/>
+                <w:i w:val="false"/>
+                <w:iCs w:val="false"/>
+                <w:color w:val="222222"/>
+                <w:sz w:val="16"/>
+                <w:szCs w:val="16"/>
+              </w:rPr>
+              <w:t xml:space="preserve">18 September 2026</w:t>
+            </w:r>
+          </w:p>
+        </w:tc>
+        <w:tc>
+          <w:tcPr>
+            <w:tcW w:type="dxa" w:w="1500"/>
+            <w:tcBorders>
+              <w:top w:val="single" w:color="C5CDD6" w:sz="4"/>
+              <w:left w:val="single" w:color="C5CDD6" w:sz="4"/>
+              <w:bottom w:val="single" w:color="C5CDD6" w:sz="4"/>
+              <w:right w:val="single" w:color="C5CDD6" w:sz="4"/>
+            </w:tcBorders>
+            <w:tcMar>
+              <w:top w:type="dxa" w:w="50"/>
+              <w:left w:type="dxa" w:w="60"/>
+              <w:bottom w:type="dxa" w:w="50"/>
+              <w:right w:type="dxa" w:w="60"/>
+            </w:tcMar>
+            <w:vAlign w:val="center"/>
+          </w:tcPr>
+          <w:p>
+            <w:pPr>
+              <w:spacing w:after="0" w:before="0"/>
+              <w:jc w:val="left"/>
+            </w:pPr>
+            <w:r>
+              <w:rPr>
+                <w:rFonts w:ascii="Calibri" w:cs="Calibri" w:eastAsia="Calibri" w:hAnsi="Calibri"/>
+                <w:b w:val="false"/>
+                <w:bCs w:val="false"/>
+                <w:i w:val="false"/>
+                <w:iCs w:val="false"/>
+                <w:color w:val="222222"/>
+                <w:sz w:val="16"/>
+                <w:szCs w:val="16"/>
+              </w:rPr>
+              <w:t xml:space="preserve">Completed</w:t>
+            </w:r>
+          </w:p>
+        </w:tc>
+      </w:tr>
+      <w:tr>
+        <w:trPr>
+          <w:cantSplit/>
+        </w:trPr>
+        <w:tc>
+          <w:tcPr>
+            <w:tcW w:type="dxa" w:w="700"/>
+            <w:tcBorders>
+              <w:top w:val="single" w:color="C5CDD6" w:sz="4"/>
+              <w:left w:val="single" w:color="C5CDD6" w:sz="4"/>
+              <w:bottom w:val="single" w:color="C5CDD6" w:sz="4"/>
+              <w:right w:val="single" w:color="C5CDD6" w:sz="4"/>
+            </w:tcBorders>
+            <w:tcMar>
+              <w:top w:type="dxa" w:w="50"/>
+              <w:left w:type="dxa" w:w="60"/>
+              <w:bottom w:type="dxa" w:w="50"/>
+              <w:right w:type="dxa" w:w="60"/>
+            </w:tcMar>
+            <w:vAlign w:val="center"/>
+          </w:tcPr>
+          <w:p>
+            <w:pPr>
+              <w:spacing w:after="0" w:before="0"/>
+              <w:jc w:val="left"/>
+            </w:pPr>
+            <w:r>
+              <w:rPr>
+                <w:rFonts w:ascii="Calibri" w:cs="Calibri" w:eastAsia="Calibri" w:hAnsi="Calibri"/>
+                <w:b w:val="false"/>
+                <w:bCs w:val="false"/>
+                <w:i w:val="false"/>
+                <w:iCs w:val="false"/>
+                <w:color w:val="222222"/>
+                <w:sz w:val="16"/>
+                <w:szCs w:val="16"/>
+              </w:rPr>
+              <w:t xml:space="preserve">7</w:t>
+            </w:r>
+          </w:p>
+        </w:tc>
+        <w:tc>
+          <w:tcPr>
+            <w:tcW w:type="dxa" w:w="3400"/>
             <w:tcBorders>
               <w:top w:val="single" w:color="C5CDD6" w:sz="4"/>
               <w:left w:val="single" w:color="C5CDD6" w:sz="4"/>
@@ -1531,38 +1985,38 @@
         </w:tc>
         <w:tc>
           <w:tcPr>
-            <w:tcW w:type="dxa" w:w="2100"/>
-            <w:tcBorders>
-              <w:top w:val="single" w:color="C5CDD6" w:sz="4"/>
-              <w:left w:val="single" w:color="C5CDD6" w:sz="4"/>
-              <w:bottom w:val="single" w:color="C5CDD6" w:sz="4"/>
-              <w:right w:val="single" w:color="C5CDD6" w:sz="4"/>
-            </w:tcBorders>
-            <w:tcMar>
-              <w:top w:type="dxa" w:w="50"/>
-              <w:left w:type="dxa" w:w="60"/>
-              <w:bottom w:type="dxa" w:w="50"/>
-              <w:right w:type="dxa" w:w="60"/>
-            </w:tcMar>
-            <w:vAlign w:val="center"/>
-          </w:tcPr>
-          <w:p>
-            <w:pPr>
-              <w:spacing w:after="0" w:before="0"/>
-              <w:jc w:val="left"/>
-            </w:pPr>
-            <w:r>
-              <w:rPr>
-                <w:rFonts w:ascii="Calibri" w:cs="Calibri" w:eastAsia="Calibri" w:hAnsi="Calibri"/>
-                <w:b w:val="false"/>
-                <w:bCs w:val="false"/>
-                <w:i w:val="false"/>
-                <w:iCs w:val="false"/>
-                <w:color w:val="222222"/>
-                <w:sz w:val="16"/>
-                <w:szCs w:val="16"/>
-              </w:rPr>
-              <w:t xml:space="preserve">For NMP use during UAT and training.</w:t>
+            <w:tcW w:type="dxa" w:w="1900"/>
+            <w:tcBorders>
+              <w:top w:val="single" w:color="C5CDD6" w:sz="4"/>
+              <w:left w:val="single" w:color="C5CDD6" w:sz="4"/>
+              <w:bottom w:val="single" w:color="C5CDD6" w:sz="4"/>
+              <w:right w:val="single" w:color="C5CDD6" w:sz="4"/>
+            </w:tcBorders>
+            <w:tcMar>
+              <w:top w:type="dxa" w:w="50"/>
+              <w:left w:type="dxa" w:w="60"/>
+              <w:bottom w:type="dxa" w:w="50"/>
+              <w:right w:type="dxa" w:w="60"/>
+            </w:tcMar>
+            <w:vAlign w:val="center"/>
+          </w:tcPr>
+          <w:p>
+            <w:pPr>
+              <w:spacing w:after="0" w:before="0"/>
+              <w:jc w:val="left"/>
+            </w:pPr>
+            <w:r>
+              <w:rPr>
+                <w:rFonts w:ascii="Calibri" w:cs="Calibri" w:eastAsia="Calibri" w:hAnsi="Calibri"/>
+                <w:b w:val="false"/>
+                <w:bCs w:val="false"/>
+                <w:i w:val="false"/>
+                <w:iCs w:val="false"/>
+                <w:color w:val="222222"/>
+                <w:sz w:val="16"/>
+                <w:szCs w:val="16"/>
+              </w:rPr>
+              <w:t xml:space="preserve">For NMP use during UAT and training</w:t>
             </w:r>
           </w:p>
         </w:tc>
@@ -1642,7 +2096,7 @@
         </w:tc>
         <w:tc>
           <w:tcPr>
-            <w:tcW w:type="dxa" w:w="1600"/>
+            <w:tcW w:type="dxa" w:w="1500"/>
             <w:tcBorders>
               <w:top w:val="single" w:color="C5CDD6" w:sz="4"/>
               <w:left w:val="single" w:color="C5CDD6" w:sz="4"/>
@@ -1697,7 +2151,7 @@
           <w:sz w:val="24"/>
           <w:szCs w:val="24"/>
         </w:rPr>
-        <w:t xml:space="preserve">Phase Completion</w:t>
+        <w:t xml:space="preserve">Phase Completion and Billing</w:t>
       </w:r>
     </w:p>
     <w:p>
@@ -1715,7 +2169,7 @@
           <w:sz w:val="22"/>
           <w:szCs w:val="22"/>
         </w:rPr>
-        <w:t xml:space="preserve">With these items delivered, the development phase is closed. The working environment was cleared of sample forms, tickets, messages, and activity logs on 22 September 2026 so Client, Admin, and Records start clean. User accounts and role assignments were kept.</w:t>
+        <w:t xml:space="preserve">With the completion of the work above, the development phase that started on 15 May 2026 is now formally closed. On 22 September 2026 the working environment was cleared of sample forms, tickets, messages, and activity logs so Client, Admin, and Records can start clean. User accounts and role assignments were kept.</w:t>
       </w:r>
     </w:p>
     <w:p>
@@ -1733,7 +2187,7 @@
           <w:sz w:val="22"/>
           <w:szCs w:val="22"/>
         </w:rPr>
-        <w:t xml:space="preserve">No invoice is reported in this letter. Billing for the completed development phase will follow the approved project terms after NMP accepts the delivered system in writing.</w:t>
+        <w:t xml:space="preserve">The system is ready for User Acceptance Testing. Billing for the completed development phase will be issued to the National Museum of the Philippines upon written acceptance of the delivered system.</w:t>
       </w:r>
     </w:p>
     <w:p>
@@ -1754,7 +2208,7 @@
           <w:sz w:val="24"/>
           <w:szCs w:val="24"/>
         </w:rPr>
-        <w:t xml:space="preserve">Project Timeline</w:t>
+        <w:t xml:space="preserve">Project Timeline (Baseline vs Actual Adjustment)</w:t>
       </w:r>
     </w:p>
     <w:p>
@@ -1772,7 +2226,7 @@
           <w:sz w:val="22"/>
           <w:szCs w:val="22"/>
         </w:rPr>
-        <w:t xml:space="preserve">Dates below are the working schedule. User Acceptance Testing, training, and go-live move only after NMP confirms the testers and the start date.</w:t>
+        <w:t xml:space="preserve">Original Period is the window in which each activity was carried out. Revised Period is the same window where the work finished as carried out. User Acceptance Testing, training, and go-live remain proposed until NMP confirms the schedule.</w:t>
       </w:r>
     </w:p>
     <w:tbl>
@@ -1788,12 +2242,12 @@
         </w:tblBorders>
       </w:tblPr>
       <w:tblGrid>
-        <w:gridCol w:w="2500"/>
-        <w:gridCol w:w="1100"/>
-        <w:gridCol w:w="800"/>
-        <w:gridCol w:w="1900"/>
-        <w:gridCol w:w="1966"/>
         <w:gridCol w:w="2200"/>
+        <w:gridCol w:w="900"/>
+        <w:gridCol w:w="700"/>
+        <w:gridCol w:w="2100"/>
+        <w:gridCol w:w="2100"/>
+        <w:gridCol w:w="2466"/>
       </w:tblGrid>
       <w:tr>
         <w:trPr>
@@ -1802,7 +2256,7 @@
         </w:trPr>
         <w:tc>
           <w:tcPr>
-            <w:tcW w:type="dxa" w:w="2500"/>
+            <w:tcW w:type="dxa" w:w="2200"/>
             <w:tcBorders>
               <w:top w:val="single" w:color="C5CDD6" w:sz="4"/>
               <w:left w:val="single" w:color="C5CDD6" w:sz="4"/>
@@ -1840,7 +2294,7 @@
         </w:tc>
         <w:tc>
           <w:tcPr>
-            <w:tcW w:type="dxa" w:w="1100"/>
+            <w:tcW w:type="dxa" w:w="900"/>
             <w:tcBorders>
               <w:top w:val="single" w:color="C5CDD6" w:sz="4"/>
               <w:left w:val="single" w:color="C5CDD6" w:sz="4"/>
@@ -1878,7 +2332,7 @@
         </w:tc>
         <w:tc>
           <w:tcPr>
-            <w:tcW w:type="dxa" w:w="800"/>
+            <w:tcW w:type="dxa" w:w="700"/>
             <w:tcBorders>
               <w:top w:val="single" w:color="C5CDD6" w:sz="4"/>
               <w:left w:val="single" w:color="C5CDD6" w:sz="4"/>
@@ -1916,7 +2370,7 @@
         </w:tc>
         <w:tc>
           <w:tcPr>
-            <w:tcW w:type="dxa" w:w="1900"/>
+            <w:tcW w:type="dxa" w:w="2100"/>
             <w:tcBorders>
               <w:top w:val="single" w:color="C5CDD6" w:sz="4"/>
               <w:left w:val="single" w:color="C5CDD6" w:sz="4"/>
@@ -1948,13 +2402,13 @@
                 <w:sz w:val="15"/>
                 <w:szCs w:val="15"/>
               </w:rPr>
-              <w:t xml:space="preserve">Period</w:t>
-            </w:r>
-          </w:p>
-        </w:tc>
-        <w:tc>
-          <w:tcPr>
-            <w:tcW w:type="dxa" w:w="1966"/>
+              <w:t xml:space="preserve">Original Period</w:t>
+            </w:r>
+          </w:p>
+        </w:tc>
+        <w:tc>
+          <w:tcPr>
+            <w:tcW w:type="dxa" w:w="2100"/>
             <w:tcBorders>
               <w:top w:val="single" w:color="C5CDD6" w:sz="4"/>
               <w:left w:val="single" w:color="C5CDD6" w:sz="4"/>
@@ -1986,13 +2440,13 @@
                 <w:sz w:val="15"/>
                 <w:szCs w:val="15"/>
               </w:rPr>
-              <w:t xml:space="preserve">Target</w:t>
-            </w:r>
-          </w:p>
-        </w:tc>
-        <w:tc>
-          <w:tcPr>
-            <w:tcW w:type="dxa" w:w="2200"/>
+              <w:t xml:space="preserve">Revised Period</w:t>
+            </w:r>
+          </w:p>
+        </w:tc>
+        <w:tc>
+          <w:tcPr>
+            <w:tcW w:type="dxa" w:w="2466"/>
             <w:tcBorders>
               <w:top w:val="single" w:color="C5CDD6" w:sz="4"/>
               <w:left w:val="single" w:color="C5CDD6" w:sz="4"/>
@@ -2035,44 +2489,44 @@
         </w:trPr>
         <w:tc>
           <w:tcPr>
-            <w:tcW w:type="dxa" w:w="2500"/>
-            <w:tcBorders>
-              <w:top w:val="single" w:color="C5CDD6" w:sz="4"/>
-              <w:left w:val="single" w:color="C5CDD6" w:sz="4"/>
-              <w:bottom w:val="single" w:color="C5CDD6" w:sz="4"/>
-              <w:right w:val="single" w:color="C5CDD6" w:sz="4"/>
-            </w:tcBorders>
-            <w:tcMar>
-              <w:top w:type="dxa" w:w="50"/>
-              <w:left w:type="dxa" w:w="60"/>
-              <w:bottom w:type="dxa" w:w="50"/>
-              <w:right w:type="dxa" w:w="60"/>
-            </w:tcMar>
-            <w:vAlign w:val="center"/>
-          </w:tcPr>
-          <w:p>
-            <w:pPr>
-              <w:spacing w:after="0" w:before="0"/>
-              <w:jc w:val="left"/>
-            </w:pPr>
-            <w:r>
-              <w:rPr>
-                <w:rFonts w:ascii="Calibri" w:cs="Calibri" w:eastAsia="Calibri" w:hAnsi="Calibri"/>
-                <w:b w:val="false"/>
-                <w:bCs w:val="false"/>
-                <w:i w:val="false"/>
-                <w:iCs w:val="false"/>
-                <w:color w:val="222222"/>
-                <w:sz w:val="16"/>
-                <w:szCs w:val="16"/>
-              </w:rPr>
-              <w:t xml:space="preserve">System development and Employee User Manual v2.3</w:t>
-            </w:r>
-          </w:p>
-        </w:tc>
-        <w:tc>
-          <w:tcPr>
-            <w:tcW w:type="dxa" w:w="1100"/>
+            <w:tcW w:type="dxa" w:w="2200"/>
+            <w:tcBorders>
+              <w:top w:val="single" w:color="C5CDD6" w:sz="4"/>
+              <w:left w:val="single" w:color="C5CDD6" w:sz="4"/>
+              <w:bottom w:val="single" w:color="C5CDD6" w:sz="4"/>
+              <w:right w:val="single" w:color="C5CDD6" w:sz="4"/>
+            </w:tcBorders>
+            <w:tcMar>
+              <w:top w:type="dxa" w:w="50"/>
+              <w:left w:type="dxa" w:w="60"/>
+              <w:bottom w:type="dxa" w:w="50"/>
+              <w:right w:type="dxa" w:w="60"/>
+            </w:tcMar>
+            <w:vAlign w:val="center"/>
+          </w:tcPr>
+          <w:p>
+            <w:pPr>
+              <w:spacing w:after="0" w:before="0"/>
+              <w:jc w:val="left"/>
+            </w:pPr>
+            <w:r>
+              <w:rPr>
+                <w:rFonts w:ascii="Calibri" w:cs="Calibri" w:eastAsia="Calibri" w:hAnsi="Calibri"/>
+                <w:b w:val="false"/>
+                <w:bCs w:val="false"/>
+                <w:i w:val="false"/>
+                <w:iCs w:val="false"/>
+                <w:color w:val="222222"/>
+                <w:sz w:val="16"/>
+                <w:szCs w:val="16"/>
+              </w:rPr>
+              <w:t xml:space="preserve">Project start and initial Technical Assistance Request System</w:t>
+            </w:r>
+          </w:p>
+        </w:tc>
+        <w:tc>
+          <w:tcPr>
+            <w:tcW w:type="dxa" w:w="900"/>
             <w:tcBorders>
               <w:top w:val="single" w:color="C5CDD6" w:sz="4"/>
               <w:left w:val="single" w:color="C5CDD6" w:sz="4"/>
@@ -2109,118 +2563,118 @@
         </w:tc>
         <w:tc>
           <w:tcPr>
-            <w:tcW w:type="dxa" w:w="800"/>
-            <w:tcBorders>
-              <w:top w:val="single" w:color="C5CDD6" w:sz="4"/>
-              <w:left w:val="single" w:color="C5CDD6" w:sz="4"/>
-              <w:bottom w:val="single" w:color="C5CDD6" w:sz="4"/>
-              <w:right w:val="single" w:color="C5CDD6" w:sz="4"/>
-            </w:tcBorders>
-            <w:tcMar>
-              <w:top w:type="dxa" w:w="50"/>
-              <w:left w:type="dxa" w:w="60"/>
-              <w:bottom w:type="dxa" w:w="50"/>
-              <w:right w:type="dxa" w:w="60"/>
-            </w:tcMar>
-            <w:vAlign w:val="center"/>
-          </w:tcPr>
-          <w:p>
-            <w:pPr>
-              <w:spacing w:after="0" w:before="0"/>
-              <w:jc w:val="left"/>
-            </w:pPr>
-            <w:r>
-              <w:rPr>
-                <w:rFonts w:ascii="Calibri" w:cs="Calibri" w:eastAsia="Calibri" w:hAnsi="Calibri"/>
-                <w:b w:val="false"/>
-                <w:bCs w:val="false"/>
-                <w:i w:val="false"/>
-                <w:iCs w:val="false"/>
-                <w:color w:val="222222"/>
-                <w:sz w:val="16"/>
-                <w:szCs w:val="16"/>
-              </w:rPr>
-              <w:t xml:space="preserve">—</w:t>
-            </w:r>
-          </w:p>
-        </w:tc>
-        <w:tc>
-          <w:tcPr>
-            <w:tcW w:type="dxa" w:w="1900"/>
-            <w:tcBorders>
-              <w:top w:val="single" w:color="C5CDD6" w:sz="4"/>
-              <w:left w:val="single" w:color="C5CDD6" w:sz="4"/>
-              <w:bottom w:val="single" w:color="C5CDD6" w:sz="4"/>
-              <w:right w:val="single" w:color="C5CDD6" w:sz="4"/>
-            </w:tcBorders>
-            <w:tcMar>
-              <w:top w:type="dxa" w:w="50"/>
-              <w:left w:type="dxa" w:w="60"/>
-              <w:bottom w:type="dxa" w:w="50"/>
-              <w:right w:type="dxa" w:w="60"/>
-            </w:tcMar>
-            <w:vAlign w:val="center"/>
-          </w:tcPr>
-          <w:p>
-            <w:pPr>
-              <w:spacing w:after="0" w:before="0"/>
-              <w:jc w:val="left"/>
-            </w:pPr>
-            <w:r>
-              <w:rPr>
-                <w:rFonts w:ascii="Calibri" w:cs="Calibri" w:eastAsia="Calibri" w:hAnsi="Calibri"/>
-                <w:b w:val="false"/>
-                <w:bCs w:val="false"/>
-                <w:i w:val="false"/>
-                <w:iCs w:val="false"/>
-                <w:color w:val="222222"/>
-                <w:sz w:val="16"/>
-                <w:szCs w:val="16"/>
-              </w:rPr>
-              <w:t xml:space="preserve">Completed</w:t>
-            </w:r>
-          </w:p>
-        </w:tc>
-        <w:tc>
-          <w:tcPr>
-            <w:tcW w:type="dxa" w:w="1966"/>
-            <w:tcBorders>
-              <w:top w:val="single" w:color="C5CDD6" w:sz="4"/>
-              <w:left w:val="single" w:color="C5CDD6" w:sz="4"/>
-              <w:bottom w:val="single" w:color="C5CDD6" w:sz="4"/>
-              <w:right w:val="single" w:color="C5CDD6" w:sz="4"/>
-            </w:tcBorders>
-            <w:tcMar>
-              <w:top w:type="dxa" w:w="50"/>
-              <w:left w:type="dxa" w:w="60"/>
-              <w:bottom w:type="dxa" w:w="50"/>
-              <w:right w:type="dxa" w:w="60"/>
-            </w:tcMar>
-            <w:vAlign w:val="center"/>
-          </w:tcPr>
-          <w:p>
-            <w:pPr>
-              <w:spacing w:after="0" w:before="0"/>
-              <w:jc w:val="left"/>
-            </w:pPr>
-            <w:r>
-              <w:rPr>
-                <w:rFonts w:ascii="Calibri" w:cs="Calibri" w:eastAsia="Calibri" w:hAnsi="Calibri"/>
-                <w:b w:val="false"/>
-                <w:bCs w:val="false"/>
-                <w:i w:val="false"/>
-                <w:iCs w:val="false"/>
-                <w:color w:val="222222"/>
-                <w:sz w:val="16"/>
-                <w:szCs w:val="16"/>
-              </w:rPr>
-              <w:t xml:space="preserve">22 September 2026</w:t>
-            </w:r>
-          </w:p>
-        </w:tc>
-        <w:tc>
-          <w:tcPr>
-            <w:tcW w:type="dxa" w:w="2200"/>
+            <w:tcW w:type="dxa" w:w="700"/>
+            <w:tcBorders>
+              <w:top w:val="single" w:color="C5CDD6" w:sz="4"/>
+              <w:left w:val="single" w:color="C5CDD6" w:sz="4"/>
+              <w:bottom w:val="single" w:color="C5CDD6" w:sz="4"/>
+              <w:right w:val="single" w:color="C5CDD6" w:sz="4"/>
+            </w:tcBorders>
+            <w:tcMar>
+              <w:top w:type="dxa" w:w="50"/>
+              <w:left w:type="dxa" w:w="60"/>
+              <w:bottom w:type="dxa" w:w="50"/>
+              <w:right w:type="dxa" w:w="60"/>
+            </w:tcMar>
+            <w:vAlign w:val="center"/>
+          </w:tcPr>
+          <w:p>
+            <w:pPr>
+              <w:spacing w:after="0" w:before="0"/>
+              <w:jc w:val="left"/>
+            </w:pPr>
+            <w:r>
+              <w:rPr>
+                <w:rFonts w:ascii="Calibri" w:cs="Calibri" w:eastAsia="Calibri" w:hAnsi="Calibri"/>
+                <w:b w:val="false"/>
+                <w:bCs w:val="false"/>
+                <w:i w:val="false"/>
+                <w:iCs w:val="false"/>
+                <w:color w:val="222222"/>
+                <w:sz w:val="16"/>
+                <w:szCs w:val="16"/>
+              </w:rPr>
+              <w:t xml:space="preserve">28</w:t>
+            </w:r>
+          </w:p>
+        </w:tc>
+        <w:tc>
+          <w:tcPr>
+            <w:tcW w:type="dxa" w:w="2100"/>
+            <w:tcBorders>
+              <w:top w:val="single" w:color="C5CDD6" w:sz="4"/>
+              <w:left w:val="single" w:color="C5CDD6" w:sz="4"/>
+              <w:bottom w:val="single" w:color="C5CDD6" w:sz="4"/>
+              <w:right w:val="single" w:color="C5CDD6" w:sz="4"/>
+            </w:tcBorders>
+            <w:tcMar>
+              <w:top w:type="dxa" w:w="50"/>
+              <w:left w:type="dxa" w:w="60"/>
+              <w:bottom w:type="dxa" w:w="50"/>
+              <w:right w:type="dxa" w:w="60"/>
+            </w:tcMar>
+            <w:vAlign w:val="center"/>
+          </w:tcPr>
+          <w:p>
+            <w:pPr>
+              <w:spacing w:after="0" w:before="0"/>
+              <w:jc w:val="left"/>
+            </w:pPr>
+            <w:r>
+              <w:rPr>
+                <w:rFonts w:ascii="Calibri" w:cs="Calibri" w:eastAsia="Calibri" w:hAnsi="Calibri"/>
+                <w:b w:val="false"/>
+                <w:bCs w:val="false"/>
+                <w:i w:val="false"/>
+                <w:iCs w:val="false"/>
+                <w:color w:val="222222"/>
+                <w:sz w:val="16"/>
+                <w:szCs w:val="16"/>
+              </w:rPr>
+              <w:t xml:space="preserve">15 May – 11 June 2026</w:t>
+            </w:r>
+          </w:p>
+        </w:tc>
+        <w:tc>
+          <w:tcPr>
+            <w:tcW w:type="dxa" w:w="2100"/>
+            <w:tcBorders>
+              <w:top w:val="single" w:color="C5CDD6" w:sz="4"/>
+              <w:left w:val="single" w:color="C5CDD6" w:sz="4"/>
+              <w:bottom w:val="single" w:color="C5CDD6" w:sz="4"/>
+              <w:right w:val="single" w:color="C5CDD6" w:sz="4"/>
+            </w:tcBorders>
+            <w:tcMar>
+              <w:top w:type="dxa" w:w="50"/>
+              <w:left w:type="dxa" w:w="60"/>
+              <w:bottom w:type="dxa" w:w="50"/>
+              <w:right w:type="dxa" w:w="60"/>
+            </w:tcMar>
+            <w:vAlign w:val="center"/>
+          </w:tcPr>
+          <w:p>
+            <w:pPr>
+              <w:spacing w:after="0" w:before="0"/>
+              <w:jc w:val="left"/>
+            </w:pPr>
+            <w:r>
+              <w:rPr>
+                <w:rFonts w:ascii="Calibri" w:cs="Calibri" w:eastAsia="Calibri" w:hAnsi="Calibri"/>
+                <w:b w:val="false"/>
+                <w:bCs w:val="false"/>
+                <w:i w:val="false"/>
+                <w:iCs w:val="false"/>
+                <w:color w:val="222222"/>
+                <w:sz w:val="16"/>
+                <w:szCs w:val="16"/>
+              </w:rPr>
+              <w:t xml:space="preserve">15 May – 11 June 2026</w:t>
+            </w:r>
+          </w:p>
+        </w:tc>
+        <w:tc>
+          <w:tcPr>
+            <w:tcW w:type="dxa" w:w="2466"/>
             <w:tcBorders>
               <w:top w:val="single" w:color="C5CDD6" w:sz="4"/>
               <w:left w:val="single" w:color="C5CDD6" w:sz="4"/>
@@ -2262,44 +2716,44 @@
         </w:trPr>
         <w:tc>
           <w:tcPr>
-            <w:tcW w:type="dxa" w:w="2500"/>
-            <w:tcBorders>
-              <w:top w:val="single" w:color="C5CDD6" w:sz="4"/>
-              <w:left w:val="single" w:color="C5CDD6" w:sz="4"/>
-              <w:bottom w:val="single" w:color="C5CDD6" w:sz="4"/>
-              <w:right w:val="single" w:color="C5CDD6" w:sz="4"/>
-            </w:tcBorders>
-            <w:tcMar>
-              <w:top w:type="dxa" w:w="50"/>
-              <w:left w:type="dxa" w:w="60"/>
-              <w:bottom w:type="dxa" w:w="50"/>
-              <w:right w:type="dxa" w:w="60"/>
-            </w:tcMar>
-            <w:vAlign w:val="center"/>
-          </w:tcPr>
-          <w:p>
-            <w:pPr>
-              <w:spacing w:after="0" w:before="0"/>
-              <w:jc w:val="left"/>
-            </w:pPr>
-            <w:r>
-              <w:rPr>
-                <w:rFonts w:ascii="Calibri" w:cs="Calibri" w:eastAsia="Calibri" w:hAnsi="Calibri"/>
-                <w:b w:val="false"/>
-                <w:bCs w:val="false"/>
-                <w:i w:val="false"/>
-                <w:iCs w:val="false"/>
-                <w:color w:val="222222"/>
-                <w:sz w:val="16"/>
-                <w:szCs w:val="16"/>
-              </w:rPr>
-              <w:t xml:space="preserve">Final verification (records review and document viewing)</w:t>
-            </w:r>
-          </w:p>
-        </w:tc>
-        <w:tc>
-          <w:tcPr>
-            <w:tcW w:type="dxa" w:w="1100"/>
+            <w:tcW w:type="dxa" w:w="2200"/>
+            <w:tcBorders>
+              <w:top w:val="single" w:color="C5CDD6" w:sz="4"/>
+              <w:left w:val="single" w:color="C5CDD6" w:sz="4"/>
+              <w:bottom w:val="single" w:color="C5CDD6" w:sz="4"/>
+              <w:right w:val="single" w:color="C5CDD6" w:sz="4"/>
+            </w:tcBorders>
+            <w:tcMar>
+              <w:top w:type="dxa" w:w="50"/>
+              <w:left w:type="dxa" w:w="60"/>
+              <w:bottom w:type="dxa" w:w="50"/>
+              <w:right w:type="dxa" w:w="60"/>
+            </w:tcMar>
+            <w:vAlign w:val="center"/>
+          </w:tcPr>
+          <w:p>
+            <w:pPr>
+              <w:spacing w:after="0" w:before="0"/>
+              <w:jc w:val="left"/>
+            </w:pPr>
+            <w:r>
+              <w:rPr>
+                <w:rFonts w:ascii="Calibri" w:cs="Calibri" w:eastAsia="Calibri" w:hAnsi="Calibri"/>
+                <w:b w:val="false"/>
+                <w:bCs w:val="false"/>
+                <w:i w:val="false"/>
+                <w:iCs w:val="false"/>
+                <w:color w:val="222222"/>
+                <w:sz w:val="16"/>
+                <w:szCs w:val="16"/>
+              </w:rPr>
+              <w:t xml:space="preserve">Portals and core request workflow (forms, approvals, assignment, feedback)</w:t>
+            </w:r>
+          </w:p>
+        </w:tc>
+        <w:tc>
+          <w:tcPr>
+            <w:tcW w:type="dxa" w:w="900"/>
             <w:tcBorders>
               <w:top w:val="single" w:color="C5CDD6" w:sz="4"/>
               <w:left w:val="single" w:color="C5CDD6" w:sz="4"/>
@@ -2336,118 +2790,118 @@
         </w:tc>
         <w:tc>
           <w:tcPr>
-            <w:tcW w:type="dxa" w:w="800"/>
-            <w:tcBorders>
-              <w:top w:val="single" w:color="C5CDD6" w:sz="4"/>
-              <w:left w:val="single" w:color="C5CDD6" w:sz="4"/>
-              <w:bottom w:val="single" w:color="C5CDD6" w:sz="4"/>
-              <w:right w:val="single" w:color="C5CDD6" w:sz="4"/>
-            </w:tcBorders>
-            <w:tcMar>
-              <w:top w:type="dxa" w:w="50"/>
-              <w:left w:type="dxa" w:w="60"/>
-              <w:bottom w:type="dxa" w:w="50"/>
-              <w:right w:type="dxa" w:w="60"/>
-            </w:tcMar>
-            <w:vAlign w:val="center"/>
-          </w:tcPr>
-          <w:p>
-            <w:pPr>
-              <w:spacing w:after="0" w:before="0"/>
-              <w:jc w:val="left"/>
-            </w:pPr>
-            <w:r>
-              <w:rPr>
-                <w:rFonts w:ascii="Calibri" w:cs="Calibri" w:eastAsia="Calibri" w:hAnsi="Calibri"/>
-                <w:b w:val="false"/>
-                <w:bCs w:val="false"/>
-                <w:i w:val="false"/>
-                <w:iCs w:val="false"/>
-                <w:color w:val="222222"/>
-                <w:sz w:val="16"/>
-                <w:szCs w:val="16"/>
-              </w:rPr>
-              <w:t xml:space="preserve">1</w:t>
-            </w:r>
-          </w:p>
-        </w:tc>
-        <w:tc>
-          <w:tcPr>
-            <w:tcW w:type="dxa" w:w="1900"/>
-            <w:tcBorders>
-              <w:top w:val="single" w:color="C5CDD6" w:sz="4"/>
-              <w:left w:val="single" w:color="C5CDD6" w:sz="4"/>
-              <w:bottom w:val="single" w:color="C5CDD6" w:sz="4"/>
-              <w:right w:val="single" w:color="C5CDD6" w:sz="4"/>
-            </w:tcBorders>
-            <w:tcMar>
-              <w:top w:type="dxa" w:w="50"/>
-              <w:left w:type="dxa" w:w="60"/>
-              <w:bottom w:type="dxa" w:w="50"/>
-              <w:right w:type="dxa" w:w="60"/>
-            </w:tcMar>
-            <w:vAlign w:val="center"/>
-          </w:tcPr>
-          <w:p>
-            <w:pPr>
-              <w:spacing w:after="0" w:before="0"/>
-              <w:jc w:val="left"/>
-            </w:pPr>
-            <w:r>
-              <w:rPr>
-                <w:rFonts w:ascii="Calibri" w:cs="Calibri" w:eastAsia="Calibri" w:hAnsi="Calibri"/>
-                <w:b w:val="false"/>
-                <w:bCs w:val="false"/>
-                <w:i w:val="false"/>
-                <w:iCs w:val="false"/>
-                <w:color w:val="222222"/>
-                <w:sz w:val="16"/>
-                <w:szCs w:val="16"/>
-              </w:rPr>
-              <w:t xml:space="preserve">23 September 2026</w:t>
-            </w:r>
-          </w:p>
-        </w:tc>
-        <w:tc>
-          <w:tcPr>
-            <w:tcW w:type="dxa" w:w="1966"/>
-            <w:tcBorders>
-              <w:top w:val="single" w:color="C5CDD6" w:sz="4"/>
-              <w:left w:val="single" w:color="C5CDD6" w:sz="4"/>
-              <w:bottom w:val="single" w:color="C5CDD6" w:sz="4"/>
-              <w:right w:val="single" w:color="C5CDD6" w:sz="4"/>
-            </w:tcBorders>
-            <w:tcMar>
-              <w:top w:type="dxa" w:w="50"/>
-              <w:left w:type="dxa" w:w="60"/>
-              <w:bottom w:type="dxa" w:w="50"/>
-              <w:right w:type="dxa" w:w="60"/>
-            </w:tcMar>
-            <w:vAlign w:val="center"/>
-          </w:tcPr>
-          <w:p>
-            <w:pPr>
-              <w:spacing w:after="0" w:before="0"/>
-              <w:jc w:val="left"/>
-            </w:pPr>
-            <w:r>
-              <w:rPr>
-                <w:rFonts w:ascii="Calibri" w:cs="Calibri" w:eastAsia="Calibri" w:hAnsi="Calibri"/>
-                <w:b w:val="false"/>
-                <w:bCs w:val="false"/>
-                <w:i w:val="false"/>
-                <w:iCs w:val="false"/>
-                <w:color w:val="222222"/>
-                <w:sz w:val="16"/>
-                <w:szCs w:val="16"/>
-              </w:rPr>
-              <w:t xml:space="preserve">23 September 2026</w:t>
-            </w:r>
-          </w:p>
-        </w:tc>
-        <w:tc>
-          <w:tcPr>
-            <w:tcW w:type="dxa" w:w="2200"/>
+            <w:tcW w:type="dxa" w:w="700"/>
+            <w:tcBorders>
+              <w:top w:val="single" w:color="C5CDD6" w:sz="4"/>
+              <w:left w:val="single" w:color="C5CDD6" w:sz="4"/>
+              <w:bottom w:val="single" w:color="C5CDD6" w:sz="4"/>
+              <w:right w:val="single" w:color="C5CDD6" w:sz="4"/>
+            </w:tcBorders>
+            <w:tcMar>
+              <w:top w:type="dxa" w:w="50"/>
+              <w:left w:type="dxa" w:w="60"/>
+              <w:bottom w:type="dxa" w:w="50"/>
+              <w:right w:type="dxa" w:w="60"/>
+            </w:tcMar>
+            <w:vAlign w:val="center"/>
+          </w:tcPr>
+          <w:p>
+            <w:pPr>
+              <w:spacing w:after="0" w:before="0"/>
+              <w:jc w:val="left"/>
+            </w:pPr>
+            <w:r>
+              <w:rPr>
+                <w:rFonts w:ascii="Calibri" w:cs="Calibri" w:eastAsia="Calibri" w:hAnsi="Calibri"/>
+                <w:b w:val="false"/>
+                <w:bCs w:val="false"/>
+                <w:i w:val="false"/>
+                <w:iCs w:val="false"/>
+                <w:color w:val="222222"/>
+                <w:sz w:val="16"/>
+                <w:szCs w:val="16"/>
+              </w:rPr>
+              <w:t xml:space="preserve">20</w:t>
+            </w:r>
+          </w:p>
+        </w:tc>
+        <w:tc>
+          <w:tcPr>
+            <w:tcW w:type="dxa" w:w="2100"/>
+            <w:tcBorders>
+              <w:top w:val="single" w:color="C5CDD6" w:sz="4"/>
+              <w:left w:val="single" w:color="C5CDD6" w:sz="4"/>
+              <w:bottom w:val="single" w:color="C5CDD6" w:sz="4"/>
+              <w:right w:val="single" w:color="C5CDD6" w:sz="4"/>
+            </w:tcBorders>
+            <w:tcMar>
+              <w:top w:type="dxa" w:w="50"/>
+              <w:left w:type="dxa" w:w="60"/>
+              <w:bottom w:type="dxa" w:w="50"/>
+              <w:right w:type="dxa" w:w="60"/>
+            </w:tcMar>
+            <w:vAlign w:val="center"/>
+          </w:tcPr>
+          <w:p>
+            <w:pPr>
+              <w:spacing w:after="0" w:before="0"/>
+              <w:jc w:val="left"/>
+            </w:pPr>
+            <w:r>
+              <w:rPr>
+                <w:rFonts w:ascii="Calibri" w:cs="Calibri" w:eastAsia="Calibri" w:hAnsi="Calibri"/>
+                <w:b w:val="false"/>
+                <w:bCs w:val="false"/>
+                <w:i w:val="false"/>
+                <w:iCs w:val="false"/>
+                <w:color w:val="222222"/>
+                <w:sz w:val="16"/>
+                <w:szCs w:val="16"/>
+              </w:rPr>
+              <w:t xml:space="preserve">11–30 June 2026</w:t>
+            </w:r>
+          </w:p>
+        </w:tc>
+        <w:tc>
+          <w:tcPr>
+            <w:tcW w:type="dxa" w:w="2100"/>
+            <w:tcBorders>
+              <w:top w:val="single" w:color="C5CDD6" w:sz="4"/>
+              <w:left w:val="single" w:color="C5CDD6" w:sz="4"/>
+              <w:bottom w:val="single" w:color="C5CDD6" w:sz="4"/>
+              <w:right w:val="single" w:color="C5CDD6" w:sz="4"/>
+            </w:tcBorders>
+            <w:tcMar>
+              <w:top w:type="dxa" w:w="50"/>
+              <w:left w:type="dxa" w:w="60"/>
+              <w:bottom w:type="dxa" w:w="50"/>
+              <w:right w:type="dxa" w:w="60"/>
+            </w:tcMar>
+            <w:vAlign w:val="center"/>
+          </w:tcPr>
+          <w:p>
+            <w:pPr>
+              <w:spacing w:after="0" w:before="0"/>
+              <w:jc w:val="left"/>
+            </w:pPr>
+            <w:r>
+              <w:rPr>
+                <w:rFonts w:ascii="Calibri" w:cs="Calibri" w:eastAsia="Calibri" w:hAnsi="Calibri"/>
+                <w:b w:val="false"/>
+                <w:bCs w:val="false"/>
+                <w:i w:val="false"/>
+                <w:iCs w:val="false"/>
+                <w:color w:val="222222"/>
+                <w:sz w:val="16"/>
+                <w:szCs w:val="16"/>
+              </w:rPr>
+              <w:t xml:space="preserve">11–30 June 2026</w:t>
+            </w:r>
+          </w:p>
+        </w:tc>
+        <w:tc>
+          <w:tcPr>
+            <w:tcW w:type="dxa" w:w="2466"/>
             <w:tcBorders>
               <w:top w:val="single" w:color="C5CDD6" w:sz="4"/>
               <w:left w:val="single" w:color="C5CDD6" w:sz="4"/>
@@ -2489,191 +2943,6 @@
         </w:trPr>
         <w:tc>
           <w:tcPr>
-            <w:tcW w:type="dxa" w:w="2500"/>
-            <w:tcBorders>
-              <w:top w:val="single" w:color="C5CDD6" w:sz="4"/>
-              <w:left w:val="single" w:color="C5CDD6" w:sz="4"/>
-              <w:bottom w:val="single" w:color="C5CDD6" w:sz="4"/>
-              <w:right w:val="single" w:color="C5CDD6" w:sz="4"/>
-            </w:tcBorders>
-            <w:tcMar>
-              <w:top w:type="dxa" w:w="50"/>
-              <w:left w:type="dxa" w:w="60"/>
-              <w:bottom w:type="dxa" w:w="50"/>
-              <w:right w:type="dxa" w:w="60"/>
-            </w:tcMar>
-            <w:vAlign w:val="center"/>
-          </w:tcPr>
-          <w:p>
-            <w:pPr>
-              <w:spacing w:after="0" w:before="0"/>
-              <w:jc w:val="left"/>
-            </w:pPr>
-            <w:r>
-              <w:rPr>
-                <w:rFonts w:ascii="Calibri" w:cs="Calibri" w:eastAsia="Calibri" w:hAnsi="Calibri"/>
-                <w:b w:val="false"/>
-                <w:bCs w:val="false"/>
-                <w:i w:val="false"/>
-                <w:iCs w:val="false"/>
-                <w:color w:val="222222"/>
-                <w:sz w:val="16"/>
-                <w:szCs w:val="16"/>
-              </w:rPr>
-              <w:t xml:space="preserve">User Acceptance Testing</w:t>
-            </w:r>
-          </w:p>
-        </w:tc>
-        <w:tc>
-          <w:tcPr>
-            <w:tcW w:type="dxa" w:w="1100"/>
-            <w:tcBorders>
-              <w:top w:val="single" w:color="C5CDD6" w:sz="4"/>
-              <w:left w:val="single" w:color="C5CDD6" w:sz="4"/>
-              <w:bottom w:val="single" w:color="C5CDD6" w:sz="4"/>
-              <w:right w:val="single" w:color="C5CDD6" w:sz="4"/>
-            </w:tcBorders>
-            <w:tcMar>
-              <w:top w:type="dxa" w:w="50"/>
-              <w:left w:type="dxa" w:w="60"/>
-              <w:bottom w:type="dxa" w:w="50"/>
-              <w:right w:type="dxa" w:w="60"/>
-            </w:tcMar>
-            <w:vAlign w:val="center"/>
-          </w:tcPr>
-          <w:p>
-            <w:pPr>
-              <w:spacing w:after="0" w:before="0"/>
-              <w:jc w:val="left"/>
-            </w:pPr>
-            <w:r>
-              <w:rPr>
-                <w:rFonts w:ascii="Calibri" w:cs="Calibri" w:eastAsia="Calibri" w:hAnsi="Calibri"/>
-                <w:b w:val="false"/>
-                <w:bCs w:val="false"/>
-                <w:i w:val="false"/>
-                <w:iCs w:val="false"/>
-                <w:color w:val="222222"/>
-                <w:sz w:val="16"/>
-                <w:szCs w:val="16"/>
-              </w:rPr>
-              <w:t xml:space="preserve">NMP</w:t>
-            </w:r>
-          </w:p>
-        </w:tc>
-        <w:tc>
-          <w:tcPr>
-            <w:tcW w:type="dxa" w:w="800"/>
-            <w:tcBorders>
-              <w:top w:val="single" w:color="C5CDD6" w:sz="4"/>
-              <w:left w:val="single" w:color="C5CDD6" w:sz="4"/>
-              <w:bottom w:val="single" w:color="C5CDD6" w:sz="4"/>
-              <w:right w:val="single" w:color="C5CDD6" w:sz="4"/>
-            </w:tcBorders>
-            <w:tcMar>
-              <w:top w:type="dxa" w:w="50"/>
-              <w:left w:type="dxa" w:w="60"/>
-              <w:bottom w:type="dxa" w:w="50"/>
-              <w:right w:type="dxa" w:w="60"/>
-            </w:tcMar>
-            <w:vAlign w:val="center"/>
-          </w:tcPr>
-          <w:p>
-            <w:pPr>
-              <w:spacing w:after="0" w:before="0"/>
-              <w:jc w:val="left"/>
-            </w:pPr>
-            <w:r>
-              <w:rPr>
-                <w:rFonts w:ascii="Calibri" w:cs="Calibri" w:eastAsia="Calibri" w:hAnsi="Calibri"/>
-                <w:b w:val="false"/>
-                <w:bCs w:val="false"/>
-                <w:i w:val="false"/>
-                <w:iCs w:val="false"/>
-                <w:color w:val="222222"/>
-                <w:sz w:val="16"/>
-                <w:szCs w:val="16"/>
-              </w:rPr>
-              <w:t xml:space="preserve">5</w:t>
-            </w:r>
-          </w:p>
-        </w:tc>
-        <w:tc>
-          <w:tcPr>
-            <w:tcW w:type="dxa" w:w="1900"/>
-            <w:tcBorders>
-              <w:top w:val="single" w:color="C5CDD6" w:sz="4"/>
-              <w:left w:val="single" w:color="C5CDD6" w:sz="4"/>
-              <w:bottom w:val="single" w:color="C5CDD6" w:sz="4"/>
-              <w:right w:val="single" w:color="C5CDD6" w:sz="4"/>
-            </w:tcBorders>
-            <w:tcMar>
-              <w:top w:type="dxa" w:w="50"/>
-              <w:left w:type="dxa" w:w="60"/>
-              <w:bottom w:type="dxa" w:w="50"/>
-              <w:right w:type="dxa" w:w="60"/>
-            </w:tcMar>
-            <w:vAlign w:val="center"/>
-          </w:tcPr>
-          <w:p>
-            <w:pPr>
-              <w:spacing w:after="0" w:before="0"/>
-              <w:jc w:val="left"/>
-            </w:pPr>
-            <w:r>
-              <w:rPr>
-                <w:rFonts w:ascii="Calibri" w:cs="Calibri" w:eastAsia="Calibri" w:hAnsi="Calibri"/>
-                <w:b w:val="false"/>
-                <w:bCs w:val="false"/>
-                <w:i w:val="false"/>
-                <w:iCs w:val="false"/>
-                <w:color w:val="222222"/>
-                <w:sz w:val="16"/>
-                <w:szCs w:val="16"/>
-              </w:rPr>
-              <w:t xml:space="preserve">24–30 September 2026</w:t>
-            </w:r>
-          </w:p>
-        </w:tc>
-        <w:tc>
-          <w:tcPr>
-            <w:tcW w:type="dxa" w:w="1966"/>
-            <w:tcBorders>
-              <w:top w:val="single" w:color="C5CDD6" w:sz="4"/>
-              <w:left w:val="single" w:color="C5CDD6" w:sz="4"/>
-              <w:bottom w:val="single" w:color="C5CDD6" w:sz="4"/>
-              <w:right w:val="single" w:color="C5CDD6" w:sz="4"/>
-            </w:tcBorders>
-            <w:tcMar>
-              <w:top w:type="dxa" w:w="50"/>
-              <w:left w:type="dxa" w:w="60"/>
-              <w:bottom w:type="dxa" w:w="50"/>
-              <w:right w:type="dxa" w:w="60"/>
-            </w:tcMar>
-            <w:vAlign w:val="center"/>
-          </w:tcPr>
-          <w:p>
-            <w:pPr>
-              <w:spacing w:after="0" w:before="0"/>
-              <w:jc w:val="left"/>
-            </w:pPr>
-            <w:r>
-              <w:rPr>
-                <w:rFonts w:ascii="Calibri" w:cs="Calibri" w:eastAsia="Calibri" w:hAnsi="Calibri"/>
-                <w:b w:val="false"/>
-                <w:bCs w:val="false"/>
-                <w:i w:val="false"/>
-                <w:iCs w:val="false"/>
-                <w:color w:val="222222"/>
-                <w:sz w:val="16"/>
-                <w:szCs w:val="16"/>
-              </w:rPr>
-              <w:t xml:space="preserve">30 September 2026</w:t>
-            </w:r>
-          </w:p>
-        </w:tc>
-        <w:tc>
-          <w:tcPr>
             <w:tcW w:type="dxa" w:w="2200"/>
             <w:tcBorders>
               <w:top w:val="single" w:color="C5CDD6" w:sz="4"/>
@@ -2705,7 +2974,192 @@
                 <w:sz w:val="16"/>
                 <w:szCs w:val="16"/>
               </w:rPr>
-              <w:t xml:space="preserve">Not started. Pending NMP confirmation.</w:t>
+              <w:t xml:space="preserve">Messaging, dashboards, and Settings</w:t>
+            </w:r>
+          </w:p>
+        </w:tc>
+        <w:tc>
+          <w:tcPr>
+            <w:tcW w:type="dxa" w:w="900"/>
+            <w:tcBorders>
+              <w:top w:val="single" w:color="C5CDD6" w:sz="4"/>
+              <w:left w:val="single" w:color="C5CDD6" w:sz="4"/>
+              <w:bottom w:val="single" w:color="C5CDD6" w:sz="4"/>
+              <w:right w:val="single" w:color="C5CDD6" w:sz="4"/>
+            </w:tcBorders>
+            <w:tcMar>
+              <w:top w:type="dxa" w:w="50"/>
+              <w:left w:type="dxa" w:w="60"/>
+              <w:bottom w:type="dxa" w:w="50"/>
+              <w:right w:type="dxa" w:w="60"/>
+            </w:tcMar>
+            <w:vAlign w:val="center"/>
+          </w:tcPr>
+          <w:p>
+            <w:pPr>
+              <w:spacing w:after="0" w:before="0"/>
+              <w:jc w:val="left"/>
+            </w:pPr>
+            <w:r>
+              <w:rPr>
+                <w:rFonts w:ascii="Calibri" w:cs="Calibri" w:eastAsia="Calibri" w:hAnsi="Calibri"/>
+                <w:b w:val="false"/>
+                <w:bCs w:val="false"/>
+                <w:i w:val="false"/>
+                <w:iCs w:val="false"/>
+                <w:color w:val="222222"/>
+                <w:sz w:val="16"/>
+                <w:szCs w:val="16"/>
+              </w:rPr>
+              <w:t xml:space="preserve">DVC</w:t>
+            </w:r>
+          </w:p>
+        </w:tc>
+        <w:tc>
+          <w:tcPr>
+            <w:tcW w:type="dxa" w:w="700"/>
+            <w:tcBorders>
+              <w:top w:val="single" w:color="C5CDD6" w:sz="4"/>
+              <w:left w:val="single" w:color="C5CDD6" w:sz="4"/>
+              <w:bottom w:val="single" w:color="C5CDD6" w:sz="4"/>
+              <w:right w:val="single" w:color="C5CDD6" w:sz="4"/>
+            </w:tcBorders>
+            <w:tcMar>
+              <w:top w:type="dxa" w:w="50"/>
+              <w:left w:type="dxa" w:w="60"/>
+              <w:bottom w:type="dxa" w:w="50"/>
+              <w:right w:type="dxa" w:w="60"/>
+            </w:tcMar>
+            <w:vAlign w:val="center"/>
+          </w:tcPr>
+          <w:p>
+            <w:pPr>
+              <w:spacing w:after="0" w:before="0"/>
+              <w:jc w:val="left"/>
+            </w:pPr>
+            <w:r>
+              <w:rPr>
+                <w:rFonts w:ascii="Calibri" w:cs="Calibri" w:eastAsia="Calibri" w:hAnsi="Calibri"/>
+                <w:b w:val="false"/>
+                <w:bCs w:val="false"/>
+                <w:i w:val="false"/>
+                <w:iCs w:val="false"/>
+                <w:color w:val="222222"/>
+                <w:sz w:val="16"/>
+                <w:szCs w:val="16"/>
+              </w:rPr>
+              <w:t xml:space="preserve">27</w:t>
+            </w:r>
+          </w:p>
+        </w:tc>
+        <w:tc>
+          <w:tcPr>
+            <w:tcW w:type="dxa" w:w="2100"/>
+            <w:tcBorders>
+              <w:top w:val="single" w:color="C5CDD6" w:sz="4"/>
+              <w:left w:val="single" w:color="C5CDD6" w:sz="4"/>
+              <w:bottom w:val="single" w:color="C5CDD6" w:sz="4"/>
+              <w:right w:val="single" w:color="C5CDD6" w:sz="4"/>
+            </w:tcBorders>
+            <w:tcMar>
+              <w:top w:type="dxa" w:w="50"/>
+              <w:left w:type="dxa" w:w="60"/>
+              <w:bottom w:type="dxa" w:w="50"/>
+              <w:right w:type="dxa" w:w="60"/>
+            </w:tcMar>
+            <w:vAlign w:val="center"/>
+          </w:tcPr>
+          <w:p>
+            <w:pPr>
+              <w:spacing w:after="0" w:before="0"/>
+              <w:jc w:val="left"/>
+            </w:pPr>
+            <w:r>
+              <w:rPr>
+                <w:rFonts w:ascii="Calibri" w:cs="Calibri" w:eastAsia="Calibri" w:hAnsi="Calibri"/>
+                <w:b w:val="false"/>
+                <w:bCs w:val="false"/>
+                <w:i w:val="false"/>
+                <w:iCs w:val="false"/>
+                <w:color w:val="222222"/>
+                <w:sz w:val="16"/>
+                <w:szCs w:val="16"/>
+              </w:rPr>
+              <w:t xml:space="preserve">2–28 July 2026</w:t>
+            </w:r>
+          </w:p>
+        </w:tc>
+        <w:tc>
+          <w:tcPr>
+            <w:tcW w:type="dxa" w:w="2100"/>
+            <w:tcBorders>
+              <w:top w:val="single" w:color="C5CDD6" w:sz="4"/>
+              <w:left w:val="single" w:color="C5CDD6" w:sz="4"/>
+              <w:bottom w:val="single" w:color="C5CDD6" w:sz="4"/>
+              <w:right w:val="single" w:color="C5CDD6" w:sz="4"/>
+            </w:tcBorders>
+            <w:tcMar>
+              <w:top w:type="dxa" w:w="50"/>
+              <w:left w:type="dxa" w:w="60"/>
+              <w:bottom w:type="dxa" w:w="50"/>
+              <w:right w:type="dxa" w:w="60"/>
+            </w:tcMar>
+            <w:vAlign w:val="center"/>
+          </w:tcPr>
+          <w:p>
+            <w:pPr>
+              <w:spacing w:after="0" w:before="0"/>
+              <w:jc w:val="left"/>
+            </w:pPr>
+            <w:r>
+              <w:rPr>
+                <w:rFonts w:ascii="Calibri" w:cs="Calibri" w:eastAsia="Calibri" w:hAnsi="Calibri"/>
+                <w:b w:val="false"/>
+                <w:bCs w:val="false"/>
+                <w:i w:val="false"/>
+                <w:iCs w:val="false"/>
+                <w:color w:val="222222"/>
+                <w:sz w:val="16"/>
+                <w:szCs w:val="16"/>
+              </w:rPr>
+              <w:t xml:space="preserve">2–28 July 2026</w:t>
+            </w:r>
+          </w:p>
+        </w:tc>
+        <w:tc>
+          <w:tcPr>
+            <w:tcW w:type="dxa" w:w="2466"/>
+            <w:tcBorders>
+              <w:top w:val="single" w:color="C5CDD6" w:sz="4"/>
+              <w:left w:val="single" w:color="C5CDD6" w:sz="4"/>
+              <w:bottom w:val="single" w:color="C5CDD6" w:sz="4"/>
+              <w:right w:val="single" w:color="C5CDD6" w:sz="4"/>
+            </w:tcBorders>
+            <w:tcMar>
+              <w:top w:type="dxa" w:w="50"/>
+              <w:left w:type="dxa" w:w="60"/>
+              <w:bottom w:type="dxa" w:w="50"/>
+              <w:right w:type="dxa" w:w="60"/>
+            </w:tcMar>
+            <w:vAlign w:val="center"/>
+          </w:tcPr>
+          <w:p>
+            <w:pPr>
+              <w:spacing w:after="0" w:before="0"/>
+              <w:jc w:val="left"/>
+            </w:pPr>
+            <w:r>
+              <w:rPr>
+                <w:rFonts w:ascii="Calibri" w:cs="Calibri" w:eastAsia="Calibri" w:hAnsi="Calibri"/>
+                <w:b w:val="false"/>
+                <w:bCs w:val="false"/>
+                <w:i w:val="false"/>
+                <w:iCs w:val="false"/>
+                <w:color w:val="222222"/>
+                <w:sz w:val="16"/>
+                <w:szCs w:val="16"/>
+              </w:rPr>
+              <w:t xml:space="preserve">Completed</w:t>
             </w:r>
           </w:p>
         </w:tc>
@@ -2716,44 +3170,44 @@
         </w:trPr>
         <w:tc>
           <w:tcPr>
-            <w:tcW w:type="dxa" w:w="2500"/>
-            <w:tcBorders>
-              <w:top w:val="single" w:color="C5CDD6" w:sz="4"/>
-              <w:left w:val="single" w:color="C5CDD6" w:sz="4"/>
-              <w:bottom w:val="single" w:color="C5CDD6" w:sz="4"/>
-              <w:right w:val="single" w:color="C5CDD6" w:sz="4"/>
-            </w:tcBorders>
-            <w:tcMar>
-              <w:top w:type="dxa" w:w="50"/>
-              <w:left w:type="dxa" w:w="60"/>
-              <w:bottom w:type="dxa" w:w="50"/>
-              <w:right w:type="dxa" w:w="60"/>
-            </w:tcMar>
-            <w:vAlign w:val="center"/>
-          </w:tcPr>
-          <w:p>
-            <w:pPr>
-              <w:spacing w:after="0" w:before="0"/>
-              <w:jc w:val="left"/>
-            </w:pPr>
-            <w:r>
-              <w:rPr>
-                <w:rFonts w:ascii="Calibri" w:cs="Calibri" w:eastAsia="Calibri" w:hAnsi="Calibri"/>
-                <w:b w:val="false"/>
-                <w:bCs w:val="false"/>
-                <w:i w:val="false"/>
-                <w:iCs w:val="false"/>
-                <w:color w:val="222222"/>
-                <w:sz w:val="16"/>
-                <w:szCs w:val="16"/>
-              </w:rPr>
-              <w:t xml:space="preserve">End-user training (Super Admin, Admin, Record Admin, Staff)</w:t>
-            </w:r>
-          </w:p>
-        </w:tc>
-        <w:tc>
-          <w:tcPr>
-            <w:tcW w:type="dxa" w:w="1100"/>
+            <w:tcW w:type="dxa" w:w="2200"/>
+            <w:tcBorders>
+              <w:top w:val="single" w:color="C5CDD6" w:sz="4"/>
+              <w:left w:val="single" w:color="C5CDD6" w:sz="4"/>
+              <w:bottom w:val="single" w:color="C5CDD6" w:sz="4"/>
+              <w:right w:val="single" w:color="C5CDD6" w:sz="4"/>
+            </w:tcBorders>
+            <w:tcMar>
+              <w:top w:type="dxa" w:w="50"/>
+              <w:left w:type="dxa" w:w="60"/>
+              <w:bottom w:type="dxa" w:w="50"/>
+              <w:right w:type="dxa" w:w="60"/>
+            </w:tcMar>
+            <w:vAlign w:val="center"/>
+          </w:tcPr>
+          <w:p>
+            <w:pPr>
+              <w:spacing w:after="0" w:before="0"/>
+              <w:jc w:val="left"/>
+            </w:pPr>
+            <w:r>
+              <w:rPr>
+                <w:rFonts w:ascii="Calibri" w:cs="Calibri" w:eastAsia="Calibri" w:hAnsi="Calibri"/>
+                <w:b w:val="false"/>
+                <w:bCs w:val="false"/>
+                <w:i w:val="false"/>
+                <w:iCs w:val="false"/>
+                <w:color w:val="222222"/>
+                <w:sz w:val="16"/>
+                <w:szCs w:val="16"/>
+              </w:rPr>
+              <w:t xml:space="preserve">Migration to Laravel and MySQL</w:t>
+            </w:r>
+          </w:p>
+        </w:tc>
+        <w:tc>
+          <w:tcPr>
+            <w:tcW w:type="dxa" w:w="900"/>
             <w:tcBorders>
               <w:top w:val="single" w:color="C5CDD6" w:sz="4"/>
               <w:left w:val="single" w:color="C5CDD6" w:sz="4"/>
@@ -2790,149 +3244,149 @@
         </w:tc>
         <w:tc>
           <w:tcPr>
-            <w:tcW w:type="dxa" w:w="800"/>
-            <w:tcBorders>
-              <w:top w:val="single" w:color="C5CDD6" w:sz="4"/>
-              <w:left w:val="single" w:color="C5CDD6" w:sz="4"/>
-              <w:bottom w:val="single" w:color="C5CDD6" w:sz="4"/>
-              <w:right w:val="single" w:color="C5CDD6" w:sz="4"/>
-            </w:tcBorders>
-            <w:tcMar>
-              <w:top w:type="dxa" w:w="50"/>
-              <w:left w:type="dxa" w:w="60"/>
-              <w:bottom w:type="dxa" w:w="50"/>
-              <w:right w:type="dxa" w:w="60"/>
-            </w:tcMar>
-            <w:vAlign w:val="center"/>
-          </w:tcPr>
-          <w:p>
-            <w:pPr>
-              <w:spacing w:after="0" w:before="0"/>
-              <w:jc w:val="left"/>
-            </w:pPr>
-            <w:r>
-              <w:rPr>
-                <w:rFonts w:ascii="Calibri" w:cs="Calibri" w:eastAsia="Calibri" w:hAnsi="Calibri"/>
-                <w:b w:val="false"/>
-                <w:bCs w:val="false"/>
-                <w:i w:val="false"/>
-                <w:iCs w:val="false"/>
-                <w:color w:val="222222"/>
-                <w:sz w:val="16"/>
-                <w:szCs w:val="16"/>
-              </w:rPr>
-              <w:t xml:space="preserve">3</w:t>
-            </w:r>
-          </w:p>
-        </w:tc>
-        <w:tc>
-          <w:tcPr>
-            <w:tcW w:type="dxa" w:w="1900"/>
-            <w:tcBorders>
-              <w:top w:val="single" w:color="C5CDD6" w:sz="4"/>
-              <w:left w:val="single" w:color="C5CDD6" w:sz="4"/>
-              <w:bottom w:val="single" w:color="C5CDD6" w:sz="4"/>
-              <w:right w:val="single" w:color="C5CDD6" w:sz="4"/>
-            </w:tcBorders>
-            <w:tcMar>
-              <w:top w:type="dxa" w:w="50"/>
-              <w:left w:type="dxa" w:w="60"/>
-              <w:bottom w:type="dxa" w:w="50"/>
-              <w:right w:type="dxa" w:w="60"/>
-            </w:tcMar>
-            <w:vAlign w:val="center"/>
-          </w:tcPr>
-          <w:p>
-            <w:pPr>
-              <w:spacing w:after="0" w:before="0"/>
-              <w:jc w:val="left"/>
-            </w:pPr>
-            <w:r>
-              <w:rPr>
-                <w:rFonts w:ascii="Calibri" w:cs="Calibri" w:eastAsia="Calibri" w:hAnsi="Calibri"/>
-                <w:b w:val="false"/>
-                <w:bCs w:val="false"/>
-                <w:i w:val="false"/>
-                <w:iCs w:val="false"/>
-                <w:color w:val="222222"/>
-                <w:sz w:val="16"/>
-                <w:szCs w:val="16"/>
-              </w:rPr>
-              <w:t xml:space="preserve">1–3 October 2026</w:t>
-            </w:r>
-          </w:p>
-        </w:tc>
-        <w:tc>
-          <w:tcPr>
-            <w:tcW w:type="dxa" w:w="1966"/>
-            <w:tcBorders>
-              <w:top w:val="single" w:color="C5CDD6" w:sz="4"/>
-              <w:left w:val="single" w:color="C5CDD6" w:sz="4"/>
-              <w:bottom w:val="single" w:color="C5CDD6" w:sz="4"/>
-              <w:right w:val="single" w:color="C5CDD6" w:sz="4"/>
-            </w:tcBorders>
-            <w:tcMar>
-              <w:top w:type="dxa" w:w="50"/>
-              <w:left w:type="dxa" w:w="60"/>
-              <w:bottom w:type="dxa" w:w="50"/>
-              <w:right w:type="dxa" w:w="60"/>
-            </w:tcMar>
-            <w:vAlign w:val="center"/>
-          </w:tcPr>
-          <w:p>
-            <w:pPr>
-              <w:spacing w:after="0" w:before="0"/>
-              <w:jc w:val="left"/>
-            </w:pPr>
-            <w:r>
-              <w:rPr>
-                <w:rFonts w:ascii="Calibri" w:cs="Calibri" w:eastAsia="Calibri" w:hAnsi="Calibri"/>
-                <w:b w:val="false"/>
-                <w:bCs w:val="false"/>
-                <w:i w:val="false"/>
-                <w:iCs w:val="false"/>
-                <w:color w:val="222222"/>
-                <w:sz w:val="16"/>
-                <w:szCs w:val="16"/>
-              </w:rPr>
-              <w:t xml:space="preserve">3 October 2026</w:t>
-            </w:r>
-          </w:p>
-        </w:tc>
-        <w:tc>
-          <w:tcPr>
-            <w:tcW w:type="dxa" w:w="2200"/>
-            <w:tcBorders>
-              <w:top w:val="single" w:color="C5CDD6" w:sz="4"/>
-              <w:left w:val="single" w:color="C5CDD6" w:sz="4"/>
-              <w:bottom w:val="single" w:color="C5CDD6" w:sz="4"/>
-              <w:right w:val="single" w:color="C5CDD6" w:sz="4"/>
-            </w:tcBorders>
-            <w:tcMar>
-              <w:top w:type="dxa" w:w="50"/>
-              <w:left w:type="dxa" w:w="60"/>
-              <w:bottom w:type="dxa" w:w="50"/>
-              <w:right w:type="dxa" w:w="60"/>
-            </w:tcMar>
-            <w:vAlign w:val="center"/>
-          </w:tcPr>
-          <w:p>
-            <w:pPr>
-              <w:spacing w:after="0" w:before="0"/>
-              <w:jc w:val="left"/>
-            </w:pPr>
-            <w:r>
-              <w:rPr>
-                <w:rFonts w:ascii="Calibri" w:cs="Calibri" w:eastAsia="Calibri" w:hAnsi="Calibri"/>
-                <w:b w:val="false"/>
-                <w:bCs w:val="false"/>
-                <w:i w:val="false"/>
-                <w:iCs w:val="false"/>
-                <w:color w:val="222222"/>
-                <w:sz w:val="16"/>
-                <w:szCs w:val="16"/>
-              </w:rPr>
-              <w:t xml:space="preserve">Not started. Follows UAT.</w:t>
+            <w:tcW w:type="dxa" w:w="700"/>
+            <w:tcBorders>
+              <w:top w:val="single" w:color="C5CDD6" w:sz="4"/>
+              <w:left w:val="single" w:color="C5CDD6" w:sz="4"/>
+              <w:bottom w:val="single" w:color="C5CDD6" w:sz="4"/>
+              <w:right w:val="single" w:color="C5CDD6" w:sz="4"/>
+            </w:tcBorders>
+            <w:tcMar>
+              <w:top w:type="dxa" w:w="50"/>
+              <w:left w:type="dxa" w:w="60"/>
+              <w:bottom w:type="dxa" w:w="50"/>
+              <w:right w:type="dxa" w:w="60"/>
+            </w:tcMar>
+            <w:vAlign w:val="center"/>
+          </w:tcPr>
+          <w:p>
+            <w:pPr>
+              <w:spacing w:after="0" w:before="0"/>
+              <w:jc w:val="left"/>
+            </w:pPr>
+            <w:r>
+              <w:rPr>
+                <w:rFonts w:ascii="Calibri" w:cs="Calibri" w:eastAsia="Calibri" w:hAnsi="Calibri"/>
+                <w:b w:val="false"/>
+                <w:bCs w:val="false"/>
+                <w:i w:val="false"/>
+                <w:iCs w:val="false"/>
+                <w:color w:val="222222"/>
+                <w:sz w:val="16"/>
+                <w:szCs w:val="16"/>
+              </w:rPr>
+              <w:t xml:space="preserve">20</w:t>
+            </w:r>
+          </w:p>
+        </w:tc>
+        <w:tc>
+          <w:tcPr>
+            <w:tcW w:type="dxa" w:w="2100"/>
+            <w:tcBorders>
+              <w:top w:val="single" w:color="C5CDD6" w:sz="4"/>
+              <w:left w:val="single" w:color="C5CDD6" w:sz="4"/>
+              <w:bottom w:val="single" w:color="C5CDD6" w:sz="4"/>
+              <w:right w:val="single" w:color="C5CDD6" w:sz="4"/>
+            </w:tcBorders>
+            <w:tcMar>
+              <w:top w:type="dxa" w:w="50"/>
+              <w:left w:type="dxa" w:w="60"/>
+              <w:bottom w:type="dxa" w:w="50"/>
+              <w:right w:type="dxa" w:w="60"/>
+            </w:tcMar>
+            <w:vAlign w:val="center"/>
+          </w:tcPr>
+          <w:p>
+            <w:pPr>
+              <w:spacing w:after="0" w:before="0"/>
+              <w:jc w:val="left"/>
+            </w:pPr>
+            <w:r>
+              <w:rPr>
+                <w:rFonts w:ascii="Calibri" w:cs="Calibri" w:eastAsia="Calibri" w:hAnsi="Calibri"/>
+                <w:b w:val="false"/>
+                <w:bCs w:val="false"/>
+                <w:i w:val="false"/>
+                <w:iCs w:val="false"/>
+                <w:color w:val="222222"/>
+                <w:sz w:val="16"/>
+                <w:szCs w:val="16"/>
+              </w:rPr>
+              <w:t xml:space="preserve">7–26 August 2026</w:t>
+            </w:r>
+          </w:p>
+        </w:tc>
+        <w:tc>
+          <w:tcPr>
+            <w:tcW w:type="dxa" w:w="2100"/>
+            <w:tcBorders>
+              <w:top w:val="single" w:color="C5CDD6" w:sz="4"/>
+              <w:left w:val="single" w:color="C5CDD6" w:sz="4"/>
+              <w:bottom w:val="single" w:color="C5CDD6" w:sz="4"/>
+              <w:right w:val="single" w:color="C5CDD6" w:sz="4"/>
+            </w:tcBorders>
+            <w:tcMar>
+              <w:top w:type="dxa" w:w="50"/>
+              <w:left w:type="dxa" w:w="60"/>
+              <w:bottom w:type="dxa" w:w="50"/>
+              <w:right w:type="dxa" w:w="60"/>
+            </w:tcMar>
+            <w:vAlign w:val="center"/>
+          </w:tcPr>
+          <w:p>
+            <w:pPr>
+              <w:spacing w:after="0" w:before="0"/>
+              <w:jc w:val="left"/>
+            </w:pPr>
+            <w:r>
+              <w:rPr>
+                <w:rFonts w:ascii="Calibri" w:cs="Calibri" w:eastAsia="Calibri" w:hAnsi="Calibri"/>
+                <w:b w:val="false"/>
+                <w:bCs w:val="false"/>
+                <w:i w:val="false"/>
+                <w:iCs w:val="false"/>
+                <w:color w:val="222222"/>
+                <w:sz w:val="16"/>
+                <w:szCs w:val="16"/>
+              </w:rPr>
+              <w:t xml:space="preserve">7–26 August 2026</w:t>
+            </w:r>
+          </w:p>
+        </w:tc>
+        <w:tc>
+          <w:tcPr>
+            <w:tcW w:type="dxa" w:w="2466"/>
+            <w:tcBorders>
+              <w:top w:val="single" w:color="C5CDD6" w:sz="4"/>
+              <w:left w:val="single" w:color="C5CDD6" w:sz="4"/>
+              <w:bottom w:val="single" w:color="C5CDD6" w:sz="4"/>
+              <w:right w:val="single" w:color="C5CDD6" w:sz="4"/>
+            </w:tcBorders>
+            <w:tcMar>
+              <w:top w:type="dxa" w:w="50"/>
+              <w:left w:type="dxa" w:w="60"/>
+              <w:bottom w:type="dxa" w:w="50"/>
+              <w:right w:type="dxa" w:w="60"/>
+            </w:tcMar>
+            <w:vAlign w:val="center"/>
+          </w:tcPr>
+          <w:p>
+            <w:pPr>
+              <w:spacing w:after="0" w:before="0"/>
+              <w:jc w:val="left"/>
+            </w:pPr>
+            <w:r>
+              <w:rPr>
+                <w:rFonts w:ascii="Calibri" w:cs="Calibri" w:eastAsia="Calibri" w:hAnsi="Calibri"/>
+                <w:b w:val="false"/>
+                <w:bCs w:val="false"/>
+                <w:i w:val="false"/>
+                <w:iCs w:val="false"/>
+                <w:color w:val="222222"/>
+                <w:sz w:val="16"/>
+                <w:szCs w:val="16"/>
+              </w:rPr>
+              <w:t xml:space="preserve">Completed</w:t>
             </w:r>
           </w:p>
         </w:tc>
@@ -2943,7 +3397,688 @@
         </w:trPr>
         <w:tc>
           <w:tcPr>
-            <w:tcW w:type="dxa" w:w="2500"/>
+            <w:tcW w:type="dxa" w:w="2200"/>
+            <w:tcBorders>
+              <w:top w:val="single" w:color="C5CDD6" w:sz="4"/>
+              <w:left w:val="single" w:color="C5CDD6" w:sz="4"/>
+              <w:bottom w:val="single" w:color="C5CDD6" w:sz="4"/>
+              <w:right w:val="single" w:color="C5CDD6" w:sz="4"/>
+            </w:tcBorders>
+            <w:tcMar>
+              <w:top w:type="dxa" w:w="50"/>
+              <w:left w:type="dxa" w:w="60"/>
+              <w:bottom w:type="dxa" w:w="50"/>
+              <w:right w:type="dxa" w:w="60"/>
+            </w:tcMar>
+            <w:vAlign w:val="center"/>
+          </w:tcPr>
+          <w:p>
+            <w:pPr>
+              <w:spacing w:after="0" w:before="0"/>
+              <w:jc w:val="left"/>
+            </w:pPr>
+            <w:r>
+              <w:rPr>
+                <w:rFonts w:ascii="Calibri" w:cs="Calibri" w:eastAsia="Calibri" w:hAnsi="Calibri"/>
+                <w:b w:val="false"/>
+                <w:bCs w:val="false"/>
+                <w:i w:val="false"/>
+                <w:iCs w:val="false"/>
+                <w:color w:val="222222"/>
+                <w:sz w:val="16"/>
+                <w:szCs w:val="16"/>
+              </w:rPr>
+              <w:t xml:space="preserve">PAMANA, Super Admin, review queues, and Employee User Manual v2.3</w:t>
+            </w:r>
+          </w:p>
+        </w:tc>
+        <w:tc>
+          <w:tcPr>
+            <w:tcW w:type="dxa" w:w="900"/>
+            <w:tcBorders>
+              <w:top w:val="single" w:color="C5CDD6" w:sz="4"/>
+              <w:left w:val="single" w:color="C5CDD6" w:sz="4"/>
+              <w:bottom w:val="single" w:color="C5CDD6" w:sz="4"/>
+              <w:right w:val="single" w:color="C5CDD6" w:sz="4"/>
+            </w:tcBorders>
+            <w:tcMar>
+              <w:top w:type="dxa" w:w="50"/>
+              <w:left w:type="dxa" w:w="60"/>
+              <w:bottom w:type="dxa" w:w="50"/>
+              <w:right w:type="dxa" w:w="60"/>
+            </w:tcMar>
+            <w:vAlign w:val="center"/>
+          </w:tcPr>
+          <w:p>
+            <w:pPr>
+              <w:spacing w:after="0" w:before="0"/>
+              <w:jc w:val="left"/>
+            </w:pPr>
+            <w:r>
+              <w:rPr>
+                <w:rFonts w:ascii="Calibri" w:cs="Calibri" w:eastAsia="Calibri" w:hAnsi="Calibri"/>
+                <w:b w:val="false"/>
+                <w:bCs w:val="false"/>
+                <w:i w:val="false"/>
+                <w:iCs w:val="false"/>
+                <w:color w:val="222222"/>
+                <w:sz w:val="16"/>
+                <w:szCs w:val="16"/>
+              </w:rPr>
+              <w:t xml:space="preserve">DVC</w:t>
+            </w:r>
+          </w:p>
+        </w:tc>
+        <w:tc>
+          <w:tcPr>
+            <w:tcW w:type="dxa" w:w="700"/>
+            <w:tcBorders>
+              <w:top w:val="single" w:color="C5CDD6" w:sz="4"/>
+              <w:left w:val="single" w:color="C5CDD6" w:sz="4"/>
+              <w:bottom w:val="single" w:color="C5CDD6" w:sz="4"/>
+              <w:right w:val="single" w:color="C5CDD6" w:sz="4"/>
+            </w:tcBorders>
+            <w:tcMar>
+              <w:top w:type="dxa" w:w="50"/>
+              <w:left w:type="dxa" w:w="60"/>
+              <w:bottom w:type="dxa" w:w="50"/>
+              <w:right w:type="dxa" w:w="60"/>
+            </w:tcMar>
+            <w:vAlign w:val="center"/>
+          </w:tcPr>
+          <w:p>
+            <w:pPr>
+              <w:spacing w:after="0" w:before="0"/>
+              <w:jc w:val="left"/>
+            </w:pPr>
+            <w:r>
+              <w:rPr>
+                <w:rFonts w:ascii="Calibri" w:cs="Calibri" w:eastAsia="Calibri" w:hAnsi="Calibri"/>
+                <w:b w:val="false"/>
+                <w:bCs w:val="false"/>
+                <w:i w:val="false"/>
+                <w:iCs w:val="false"/>
+                <w:color w:val="222222"/>
+                <w:sz w:val="16"/>
+                <w:szCs w:val="16"/>
+              </w:rPr>
+              <w:t xml:space="preserve">22</w:t>
+            </w:r>
+          </w:p>
+        </w:tc>
+        <w:tc>
+          <w:tcPr>
+            <w:tcW w:type="dxa" w:w="2100"/>
+            <w:tcBorders>
+              <w:top w:val="single" w:color="C5CDD6" w:sz="4"/>
+              <w:left w:val="single" w:color="C5CDD6" w:sz="4"/>
+              <w:bottom w:val="single" w:color="C5CDD6" w:sz="4"/>
+              <w:right w:val="single" w:color="C5CDD6" w:sz="4"/>
+            </w:tcBorders>
+            <w:tcMar>
+              <w:top w:type="dxa" w:w="50"/>
+              <w:left w:type="dxa" w:w="60"/>
+              <w:bottom w:type="dxa" w:w="50"/>
+              <w:right w:type="dxa" w:w="60"/>
+            </w:tcMar>
+            <w:vAlign w:val="center"/>
+          </w:tcPr>
+          <w:p>
+            <w:pPr>
+              <w:spacing w:after="0" w:before="0"/>
+              <w:jc w:val="left"/>
+            </w:pPr>
+            <w:r>
+              <w:rPr>
+                <w:rFonts w:ascii="Calibri" w:cs="Calibri" w:eastAsia="Calibri" w:hAnsi="Calibri"/>
+                <w:b w:val="false"/>
+                <w:bCs w:val="false"/>
+                <w:i w:val="false"/>
+                <w:iCs w:val="false"/>
+                <w:color w:val="222222"/>
+                <w:sz w:val="16"/>
+                <w:szCs w:val="16"/>
+              </w:rPr>
+              <w:t xml:space="preserve">1–22 September 2026</w:t>
+            </w:r>
+          </w:p>
+        </w:tc>
+        <w:tc>
+          <w:tcPr>
+            <w:tcW w:type="dxa" w:w="2100"/>
+            <w:tcBorders>
+              <w:top w:val="single" w:color="C5CDD6" w:sz="4"/>
+              <w:left w:val="single" w:color="C5CDD6" w:sz="4"/>
+              <w:bottom w:val="single" w:color="C5CDD6" w:sz="4"/>
+              <w:right w:val="single" w:color="C5CDD6" w:sz="4"/>
+            </w:tcBorders>
+            <w:tcMar>
+              <w:top w:type="dxa" w:w="50"/>
+              <w:left w:type="dxa" w:w="60"/>
+              <w:bottom w:type="dxa" w:w="50"/>
+              <w:right w:type="dxa" w:w="60"/>
+            </w:tcMar>
+            <w:vAlign w:val="center"/>
+          </w:tcPr>
+          <w:p>
+            <w:pPr>
+              <w:spacing w:after="0" w:before="0"/>
+              <w:jc w:val="left"/>
+            </w:pPr>
+            <w:r>
+              <w:rPr>
+                <w:rFonts w:ascii="Calibri" w:cs="Calibri" w:eastAsia="Calibri" w:hAnsi="Calibri"/>
+                <w:b w:val="false"/>
+                <w:bCs w:val="false"/>
+                <w:i w:val="false"/>
+                <w:iCs w:val="false"/>
+                <w:color w:val="222222"/>
+                <w:sz w:val="16"/>
+                <w:szCs w:val="16"/>
+              </w:rPr>
+              <w:t xml:space="preserve">1–22 September 2026</w:t>
+            </w:r>
+          </w:p>
+        </w:tc>
+        <w:tc>
+          <w:tcPr>
+            <w:tcW w:type="dxa" w:w="2466"/>
+            <w:tcBorders>
+              <w:top w:val="single" w:color="C5CDD6" w:sz="4"/>
+              <w:left w:val="single" w:color="C5CDD6" w:sz="4"/>
+              <w:bottom w:val="single" w:color="C5CDD6" w:sz="4"/>
+              <w:right w:val="single" w:color="C5CDD6" w:sz="4"/>
+            </w:tcBorders>
+            <w:tcMar>
+              <w:top w:type="dxa" w:w="50"/>
+              <w:left w:type="dxa" w:w="60"/>
+              <w:bottom w:type="dxa" w:w="50"/>
+              <w:right w:type="dxa" w:w="60"/>
+            </w:tcMar>
+            <w:vAlign w:val="center"/>
+          </w:tcPr>
+          <w:p>
+            <w:pPr>
+              <w:spacing w:after="0" w:before="0"/>
+              <w:jc w:val="left"/>
+            </w:pPr>
+            <w:r>
+              <w:rPr>
+                <w:rFonts w:ascii="Calibri" w:cs="Calibri" w:eastAsia="Calibri" w:hAnsi="Calibri"/>
+                <w:b w:val="false"/>
+                <w:bCs w:val="false"/>
+                <w:i w:val="false"/>
+                <w:iCs w:val="false"/>
+                <w:color w:val="222222"/>
+                <w:sz w:val="16"/>
+                <w:szCs w:val="16"/>
+              </w:rPr>
+              <w:t xml:space="preserve">Completed</w:t>
+            </w:r>
+          </w:p>
+        </w:tc>
+      </w:tr>
+      <w:tr>
+        <w:trPr>
+          <w:cantSplit/>
+        </w:trPr>
+        <w:tc>
+          <w:tcPr>
+            <w:tcW w:type="dxa" w:w="2200"/>
+            <w:tcBorders>
+              <w:top w:val="single" w:color="C5CDD6" w:sz="4"/>
+              <w:left w:val="single" w:color="C5CDD6" w:sz="4"/>
+              <w:bottom w:val="single" w:color="C5CDD6" w:sz="4"/>
+              <w:right w:val="single" w:color="C5CDD6" w:sz="4"/>
+            </w:tcBorders>
+            <w:tcMar>
+              <w:top w:type="dxa" w:w="50"/>
+              <w:left w:type="dxa" w:w="60"/>
+              <w:bottom w:type="dxa" w:w="50"/>
+              <w:right w:type="dxa" w:w="60"/>
+            </w:tcMar>
+            <w:vAlign w:val="center"/>
+          </w:tcPr>
+          <w:p>
+            <w:pPr>
+              <w:spacing w:after="0" w:before="0"/>
+              <w:jc w:val="left"/>
+            </w:pPr>
+            <w:r>
+              <w:rPr>
+                <w:rFonts w:ascii="Calibri" w:cs="Calibri" w:eastAsia="Calibri" w:hAnsi="Calibri"/>
+                <w:b w:val="false"/>
+                <w:bCs w:val="false"/>
+                <w:i w:val="false"/>
+                <w:iCs w:val="false"/>
+                <w:color w:val="222222"/>
+                <w:sz w:val="16"/>
+                <w:szCs w:val="16"/>
+              </w:rPr>
+              <w:t xml:space="preserve">User Acceptance Testing</w:t>
+            </w:r>
+          </w:p>
+        </w:tc>
+        <w:tc>
+          <w:tcPr>
+            <w:tcW w:type="dxa" w:w="900"/>
+            <w:tcBorders>
+              <w:top w:val="single" w:color="C5CDD6" w:sz="4"/>
+              <w:left w:val="single" w:color="C5CDD6" w:sz="4"/>
+              <w:bottom w:val="single" w:color="C5CDD6" w:sz="4"/>
+              <w:right w:val="single" w:color="C5CDD6" w:sz="4"/>
+            </w:tcBorders>
+            <w:tcMar>
+              <w:top w:type="dxa" w:w="50"/>
+              <w:left w:type="dxa" w:w="60"/>
+              <w:bottom w:type="dxa" w:w="50"/>
+              <w:right w:type="dxa" w:w="60"/>
+            </w:tcMar>
+            <w:vAlign w:val="center"/>
+          </w:tcPr>
+          <w:p>
+            <w:pPr>
+              <w:spacing w:after="0" w:before="0"/>
+              <w:jc w:val="left"/>
+            </w:pPr>
+            <w:r>
+              <w:rPr>
+                <w:rFonts w:ascii="Calibri" w:cs="Calibri" w:eastAsia="Calibri" w:hAnsi="Calibri"/>
+                <w:b w:val="false"/>
+                <w:bCs w:val="false"/>
+                <w:i w:val="false"/>
+                <w:iCs w:val="false"/>
+                <w:color w:val="222222"/>
+                <w:sz w:val="16"/>
+                <w:szCs w:val="16"/>
+              </w:rPr>
+              <w:t xml:space="preserve">NMP</w:t>
+            </w:r>
+          </w:p>
+        </w:tc>
+        <w:tc>
+          <w:tcPr>
+            <w:tcW w:type="dxa" w:w="700"/>
+            <w:tcBorders>
+              <w:top w:val="single" w:color="C5CDD6" w:sz="4"/>
+              <w:left w:val="single" w:color="C5CDD6" w:sz="4"/>
+              <w:bottom w:val="single" w:color="C5CDD6" w:sz="4"/>
+              <w:right w:val="single" w:color="C5CDD6" w:sz="4"/>
+            </w:tcBorders>
+            <w:tcMar>
+              <w:top w:type="dxa" w:w="50"/>
+              <w:left w:type="dxa" w:w="60"/>
+              <w:bottom w:type="dxa" w:w="50"/>
+              <w:right w:type="dxa" w:w="60"/>
+            </w:tcMar>
+            <w:vAlign w:val="center"/>
+          </w:tcPr>
+          <w:p>
+            <w:pPr>
+              <w:spacing w:after="0" w:before="0"/>
+              <w:jc w:val="left"/>
+            </w:pPr>
+            <w:r>
+              <w:rPr>
+                <w:rFonts w:ascii="Calibri" w:cs="Calibri" w:eastAsia="Calibri" w:hAnsi="Calibri"/>
+                <w:b w:val="false"/>
+                <w:bCs w:val="false"/>
+                <w:i w:val="false"/>
+                <w:iCs w:val="false"/>
+                <w:color w:val="222222"/>
+                <w:sz w:val="16"/>
+                <w:szCs w:val="16"/>
+              </w:rPr>
+              <w:t xml:space="preserve">5</w:t>
+            </w:r>
+          </w:p>
+        </w:tc>
+        <w:tc>
+          <w:tcPr>
+            <w:tcW w:type="dxa" w:w="2100"/>
+            <w:tcBorders>
+              <w:top w:val="single" w:color="C5CDD6" w:sz="4"/>
+              <w:left w:val="single" w:color="C5CDD6" w:sz="4"/>
+              <w:bottom w:val="single" w:color="C5CDD6" w:sz="4"/>
+              <w:right w:val="single" w:color="C5CDD6" w:sz="4"/>
+            </w:tcBorders>
+            <w:tcMar>
+              <w:top w:type="dxa" w:w="50"/>
+              <w:left w:type="dxa" w:w="60"/>
+              <w:bottom w:type="dxa" w:w="50"/>
+              <w:right w:type="dxa" w:w="60"/>
+            </w:tcMar>
+            <w:vAlign w:val="center"/>
+          </w:tcPr>
+          <w:p>
+            <w:pPr>
+              <w:spacing w:after="0" w:before="0"/>
+              <w:jc w:val="left"/>
+            </w:pPr>
+            <w:r>
+              <w:rPr>
+                <w:rFonts w:ascii="Calibri" w:cs="Calibri" w:eastAsia="Calibri" w:hAnsi="Calibri"/>
+                <w:b w:val="false"/>
+                <w:bCs w:val="false"/>
+                <w:i w:val="false"/>
+                <w:iCs w:val="false"/>
+                <w:color w:val="222222"/>
+                <w:sz w:val="16"/>
+                <w:szCs w:val="16"/>
+              </w:rPr>
+              <w:t xml:space="preserve">24–30 September 2026</w:t>
+            </w:r>
+          </w:p>
+        </w:tc>
+        <w:tc>
+          <w:tcPr>
+            <w:tcW w:type="dxa" w:w="2100"/>
+            <w:tcBorders>
+              <w:top w:val="single" w:color="C5CDD6" w:sz="4"/>
+              <w:left w:val="single" w:color="C5CDD6" w:sz="4"/>
+              <w:bottom w:val="single" w:color="C5CDD6" w:sz="4"/>
+              <w:right w:val="single" w:color="C5CDD6" w:sz="4"/>
+            </w:tcBorders>
+            <w:tcMar>
+              <w:top w:type="dxa" w:w="50"/>
+              <w:left w:type="dxa" w:w="60"/>
+              <w:bottom w:type="dxa" w:w="50"/>
+              <w:right w:type="dxa" w:w="60"/>
+            </w:tcMar>
+            <w:vAlign w:val="center"/>
+          </w:tcPr>
+          <w:p>
+            <w:pPr>
+              <w:spacing w:after="0" w:before="0"/>
+              <w:jc w:val="left"/>
+            </w:pPr>
+            <w:r>
+              <w:rPr>
+                <w:rFonts w:ascii="Calibri" w:cs="Calibri" w:eastAsia="Calibri" w:hAnsi="Calibri"/>
+                <w:b w:val="false"/>
+                <w:bCs w:val="false"/>
+                <w:i w:val="false"/>
+                <w:iCs w:val="false"/>
+                <w:color w:val="222222"/>
+                <w:sz w:val="16"/>
+                <w:szCs w:val="16"/>
+              </w:rPr>
+              <w:t xml:space="preserve">24–30 September 2026</w:t>
+            </w:r>
+          </w:p>
+        </w:tc>
+        <w:tc>
+          <w:tcPr>
+            <w:tcW w:type="dxa" w:w="2466"/>
+            <w:tcBorders>
+              <w:top w:val="single" w:color="C5CDD6" w:sz="4"/>
+              <w:left w:val="single" w:color="C5CDD6" w:sz="4"/>
+              <w:bottom w:val="single" w:color="C5CDD6" w:sz="4"/>
+              <w:right w:val="single" w:color="C5CDD6" w:sz="4"/>
+            </w:tcBorders>
+            <w:tcMar>
+              <w:top w:type="dxa" w:w="50"/>
+              <w:left w:type="dxa" w:w="60"/>
+              <w:bottom w:type="dxa" w:w="50"/>
+              <w:right w:type="dxa" w:w="60"/>
+            </w:tcMar>
+            <w:vAlign w:val="center"/>
+          </w:tcPr>
+          <w:p>
+            <w:pPr>
+              <w:spacing w:after="0" w:before="0"/>
+              <w:jc w:val="left"/>
+            </w:pPr>
+            <w:r>
+              <w:rPr>
+                <w:rFonts w:ascii="Calibri" w:cs="Calibri" w:eastAsia="Calibri" w:hAnsi="Calibri"/>
+                <w:b w:val="false"/>
+                <w:bCs w:val="false"/>
+                <w:i w:val="false"/>
+                <w:iCs w:val="false"/>
+                <w:color w:val="222222"/>
+                <w:sz w:val="16"/>
+                <w:szCs w:val="16"/>
+              </w:rPr>
+              <w:t xml:space="preserve">Not Started</w:t>
+            </w:r>
+          </w:p>
+        </w:tc>
+      </w:tr>
+      <w:tr>
+        <w:trPr>
+          <w:cantSplit/>
+        </w:trPr>
+        <w:tc>
+          <w:tcPr>
+            <w:tcW w:type="dxa" w:w="2200"/>
+            <w:tcBorders>
+              <w:top w:val="single" w:color="C5CDD6" w:sz="4"/>
+              <w:left w:val="single" w:color="C5CDD6" w:sz="4"/>
+              <w:bottom w:val="single" w:color="C5CDD6" w:sz="4"/>
+              <w:right w:val="single" w:color="C5CDD6" w:sz="4"/>
+            </w:tcBorders>
+            <w:tcMar>
+              <w:top w:type="dxa" w:w="50"/>
+              <w:left w:type="dxa" w:w="60"/>
+              <w:bottom w:type="dxa" w:w="50"/>
+              <w:right w:type="dxa" w:w="60"/>
+            </w:tcMar>
+            <w:vAlign w:val="center"/>
+          </w:tcPr>
+          <w:p>
+            <w:pPr>
+              <w:spacing w:after="0" w:before="0"/>
+              <w:jc w:val="left"/>
+            </w:pPr>
+            <w:r>
+              <w:rPr>
+                <w:rFonts w:ascii="Calibri" w:cs="Calibri" w:eastAsia="Calibri" w:hAnsi="Calibri"/>
+                <w:b w:val="false"/>
+                <w:bCs w:val="false"/>
+                <w:i w:val="false"/>
+                <w:iCs w:val="false"/>
+                <w:color w:val="222222"/>
+                <w:sz w:val="16"/>
+                <w:szCs w:val="16"/>
+              </w:rPr>
+              <w:t xml:space="preserve">End-user training</w:t>
+            </w:r>
+          </w:p>
+        </w:tc>
+        <w:tc>
+          <w:tcPr>
+            <w:tcW w:type="dxa" w:w="900"/>
+            <w:tcBorders>
+              <w:top w:val="single" w:color="C5CDD6" w:sz="4"/>
+              <w:left w:val="single" w:color="C5CDD6" w:sz="4"/>
+              <w:bottom w:val="single" w:color="C5CDD6" w:sz="4"/>
+              <w:right w:val="single" w:color="C5CDD6" w:sz="4"/>
+            </w:tcBorders>
+            <w:tcMar>
+              <w:top w:type="dxa" w:w="50"/>
+              <w:left w:type="dxa" w:w="60"/>
+              <w:bottom w:type="dxa" w:w="50"/>
+              <w:right w:type="dxa" w:w="60"/>
+            </w:tcMar>
+            <w:vAlign w:val="center"/>
+          </w:tcPr>
+          <w:p>
+            <w:pPr>
+              <w:spacing w:after="0" w:before="0"/>
+              <w:jc w:val="left"/>
+            </w:pPr>
+            <w:r>
+              <w:rPr>
+                <w:rFonts w:ascii="Calibri" w:cs="Calibri" w:eastAsia="Calibri" w:hAnsi="Calibri"/>
+                <w:b w:val="false"/>
+                <w:bCs w:val="false"/>
+                <w:i w:val="false"/>
+                <w:iCs w:val="false"/>
+                <w:color w:val="222222"/>
+                <w:sz w:val="16"/>
+                <w:szCs w:val="16"/>
+              </w:rPr>
+              <w:t xml:space="preserve">DVC</w:t>
+            </w:r>
+          </w:p>
+        </w:tc>
+        <w:tc>
+          <w:tcPr>
+            <w:tcW w:type="dxa" w:w="700"/>
+            <w:tcBorders>
+              <w:top w:val="single" w:color="C5CDD6" w:sz="4"/>
+              <w:left w:val="single" w:color="C5CDD6" w:sz="4"/>
+              <w:bottom w:val="single" w:color="C5CDD6" w:sz="4"/>
+              <w:right w:val="single" w:color="C5CDD6" w:sz="4"/>
+            </w:tcBorders>
+            <w:tcMar>
+              <w:top w:type="dxa" w:w="50"/>
+              <w:left w:type="dxa" w:w="60"/>
+              <w:bottom w:type="dxa" w:w="50"/>
+              <w:right w:type="dxa" w:w="60"/>
+            </w:tcMar>
+            <w:vAlign w:val="center"/>
+          </w:tcPr>
+          <w:p>
+            <w:pPr>
+              <w:spacing w:after="0" w:before="0"/>
+              <w:jc w:val="left"/>
+            </w:pPr>
+            <w:r>
+              <w:rPr>
+                <w:rFonts w:ascii="Calibri" w:cs="Calibri" w:eastAsia="Calibri" w:hAnsi="Calibri"/>
+                <w:b w:val="false"/>
+                <w:bCs w:val="false"/>
+                <w:i w:val="false"/>
+                <w:iCs w:val="false"/>
+                <w:color w:val="222222"/>
+                <w:sz w:val="16"/>
+                <w:szCs w:val="16"/>
+              </w:rPr>
+              <w:t xml:space="preserve">3</w:t>
+            </w:r>
+          </w:p>
+        </w:tc>
+        <w:tc>
+          <w:tcPr>
+            <w:tcW w:type="dxa" w:w="2100"/>
+            <w:tcBorders>
+              <w:top w:val="single" w:color="C5CDD6" w:sz="4"/>
+              <w:left w:val="single" w:color="C5CDD6" w:sz="4"/>
+              <w:bottom w:val="single" w:color="C5CDD6" w:sz="4"/>
+              <w:right w:val="single" w:color="C5CDD6" w:sz="4"/>
+            </w:tcBorders>
+            <w:tcMar>
+              <w:top w:type="dxa" w:w="50"/>
+              <w:left w:type="dxa" w:w="60"/>
+              <w:bottom w:type="dxa" w:w="50"/>
+              <w:right w:type="dxa" w:w="60"/>
+            </w:tcMar>
+            <w:vAlign w:val="center"/>
+          </w:tcPr>
+          <w:p>
+            <w:pPr>
+              <w:spacing w:after="0" w:before="0"/>
+              <w:jc w:val="left"/>
+            </w:pPr>
+            <w:r>
+              <w:rPr>
+                <w:rFonts w:ascii="Calibri" w:cs="Calibri" w:eastAsia="Calibri" w:hAnsi="Calibri"/>
+                <w:b w:val="false"/>
+                <w:bCs w:val="false"/>
+                <w:i w:val="false"/>
+                <w:iCs w:val="false"/>
+                <w:color w:val="222222"/>
+                <w:sz w:val="16"/>
+                <w:szCs w:val="16"/>
+              </w:rPr>
+              <w:t xml:space="preserve">1–3 October 2026</w:t>
+            </w:r>
+          </w:p>
+        </w:tc>
+        <w:tc>
+          <w:tcPr>
+            <w:tcW w:type="dxa" w:w="2100"/>
+            <w:tcBorders>
+              <w:top w:val="single" w:color="C5CDD6" w:sz="4"/>
+              <w:left w:val="single" w:color="C5CDD6" w:sz="4"/>
+              <w:bottom w:val="single" w:color="C5CDD6" w:sz="4"/>
+              <w:right w:val="single" w:color="C5CDD6" w:sz="4"/>
+            </w:tcBorders>
+            <w:tcMar>
+              <w:top w:type="dxa" w:w="50"/>
+              <w:left w:type="dxa" w:w="60"/>
+              <w:bottom w:type="dxa" w:w="50"/>
+              <w:right w:type="dxa" w:w="60"/>
+            </w:tcMar>
+            <w:vAlign w:val="center"/>
+          </w:tcPr>
+          <w:p>
+            <w:pPr>
+              <w:spacing w:after="0" w:before="0"/>
+              <w:jc w:val="left"/>
+            </w:pPr>
+            <w:r>
+              <w:rPr>
+                <w:rFonts w:ascii="Calibri" w:cs="Calibri" w:eastAsia="Calibri" w:hAnsi="Calibri"/>
+                <w:b w:val="false"/>
+                <w:bCs w:val="false"/>
+                <w:i w:val="false"/>
+                <w:iCs w:val="false"/>
+                <w:color w:val="222222"/>
+                <w:sz w:val="16"/>
+                <w:szCs w:val="16"/>
+              </w:rPr>
+              <w:t xml:space="preserve">1–3 October 2026</w:t>
+            </w:r>
+          </w:p>
+        </w:tc>
+        <w:tc>
+          <w:tcPr>
+            <w:tcW w:type="dxa" w:w="2466"/>
+            <w:tcBorders>
+              <w:top w:val="single" w:color="C5CDD6" w:sz="4"/>
+              <w:left w:val="single" w:color="C5CDD6" w:sz="4"/>
+              <w:bottom w:val="single" w:color="C5CDD6" w:sz="4"/>
+              <w:right w:val="single" w:color="C5CDD6" w:sz="4"/>
+            </w:tcBorders>
+            <w:tcMar>
+              <w:top w:type="dxa" w:w="50"/>
+              <w:left w:type="dxa" w:w="60"/>
+              <w:bottom w:type="dxa" w:w="50"/>
+              <w:right w:type="dxa" w:w="60"/>
+            </w:tcMar>
+            <w:vAlign w:val="center"/>
+          </w:tcPr>
+          <w:p>
+            <w:pPr>
+              <w:spacing w:after="0" w:before="0"/>
+              <w:jc w:val="left"/>
+            </w:pPr>
+            <w:r>
+              <w:rPr>
+                <w:rFonts w:ascii="Calibri" w:cs="Calibri" w:eastAsia="Calibri" w:hAnsi="Calibri"/>
+                <w:b w:val="false"/>
+                <w:bCs w:val="false"/>
+                <w:i w:val="false"/>
+                <w:iCs w:val="false"/>
+                <w:color w:val="222222"/>
+                <w:sz w:val="16"/>
+                <w:szCs w:val="16"/>
+              </w:rPr>
+              <w:t xml:space="preserve">Not Started</w:t>
+            </w:r>
+          </w:p>
+        </w:tc>
+      </w:tr>
+      <w:tr>
+        <w:trPr>
+          <w:cantSplit/>
+        </w:trPr>
+        <w:tc>
+          <w:tcPr>
+            <w:tcW w:type="dxa" w:w="2200"/>
             <w:tcBorders>
               <w:top w:val="single" w:color="C5CDD6" w:sz="4"/>
               <w:left w:val="single" w:color="C5CDD6" w:sz="4"/>
@@ -2980,7 +4115,7 @@
         </w:tc>
         <w:tc>
           <w:tcPr>
-            <w:tcW w:type="dxa" w:w="1100"/>
+            <w:tcW w:type="dxa" w:w="900"/>
             <w:tcBorders>
               <w:top w:val="single" w:color="C5CDD6" w:sz="4"/>
               <w:left w:val="single" w:color="C5CDD6" w:sz="4"/>
@@ -3017,7 +4152,7 @@
         </w:tc>
         <w:tc>
           <w:tcPr>
-            <w:tcW w:type="dxa" w:w="800"/>
+            <w:tcW w:type="dxa" w:w="700"/>
             <w:tcBorders>
               <w:top w:val="single" w:color="C5CDD6" w:sz="4"/>
               <w:left w:val="single" w:color="C5CDD6" w:sz="4"/>
@@ -3054,7 +4189,7 @@
         </w:tc>
         <w:tc>
           <w:tcPr>
-            <w:tcW w:type="dxa" w:w="1900"/>
+            <w:tcW w:type="dxa" w:w="2100"/>
             <w:tcBorders>
               <w:top w:val="single" w:color="C5CDD6" w:sz="4"/>
               <w:left w:val="single" w:color="C5CDD6" w:sz="4"/>
@@ -3091,7 +4226,7 @@
         </w:tc>
         <w:tc>
           <w:tcPr>
-            <w:tcW w:type="dxa" w:w="1966"/>
+            <w:tcW w:type="dxa" w:w="2100"/>
             <w:tcBorders>
               <w:top w:val="single" w:color="C5CDD6" w:sz="4"/>
               <w:left w:val="single" w:color="C5CDD6" w:sz="4"/>
@@ -3128,38 +4263,38 @@
         </w:tc>
         <w:tc>
           <w:tcPr>
-            <w:tcW w:type="dxa" w:w="2200"/>
-            <w:tcBorders>
-              <w:top w:val="single" w:color="C5CDD6" w:sz="4"/>
-              <w:left w:val="single" w:color="C5CDD6" w:sz="4"/>
-              <w:bottom w:val="single" w:color="C5CDD6" w:sz="4"/>
-              <w:right w:val="single" w:color="C5CDD6" w:sz="4"/>
-            </w:tcBorders>
-            <w:tcMar>
-              <w:top w:type="dxa" w:w="50"/>
-              <w:left w:type="dxa" w:w="60"/>
-              <w:bottom w:type="dxa" w:w="50"/>
-              <w:right w:type="dxa" w:w="60"/>
-            </w:tcMar>
-            <w:vAlign w:val="center"/>
-          </w:tcPr>
-          <w:p>
-            <w:pPr>
-              <w:spacing w:after="0" w:before="0"/>
-              <w:jc w:val="left"/>
-            </w:pPr>
-            <w:r>
-              <w:rPr>
-                <w:rFonts w:ascii="Calibri" w:cs="Calibri" w:eastAsia="Calibri" w:hAnsi="Calibri"/>
-                <w:b w:val="false"/>
-                <w:bCs w:val="false"/>
-                <w:i w:val="false"/>
-                <w:iCs w:val="false"/>
-                <w:color w:val="222222"/>
-                <w:sz w:val="16"/>
-                <w:szCs w:val="16"/>
-              </w:rPr>
-              <w:t xml:space="preserve">Not started. Follows training and acceptance.</w:t>
+            <w:tcW w:type="dxa" w:w="2466"/>
+            <w:tcBorders>
+              <w:top w:val="single" w:color="C5CDD6" w:sz="4"/>
+              <w:left w:val="single" w:color="C5CDD6" w:sz="4"/>
+              <w:bottom w:val="single" w:color="C5CDD6" w:sz="4"/>
+              <w:right w:val="single" w:color="C5CDD6" w:sz="4"/>
+            </w:tcBorders>
+            <w:tcMar>
+              <w:top w:type="dxa" w:w="50"/>
+              <w:left w:type="dxa" w:w="60"/>
+              <w:bottom w:type="dxa" w:w="50"/>
+              <w:right w:type="dxa" w:w="60"/>
+            </w:tcMar>
+            <w:vAlign w:val="center"/>
+          </w:tcPr>
+          <w:p>
+            <w:pPr>
+              <w:spacing w:after="0" w:before="0"/>
+              <w:jc w:val="left"/>
+            </w:pPr>
+            <w:r>
+              <w:rPr>
+                <w:rFonts w:ascii="Calibri" w:cs="Calibri" w:eastAsia="Calibri" w:hAnsi="Calibri"/>
+                <w:b w:val="false"/>
+                <w:bCs w:val="false"/>
+                <w:i w:val="false"/>
+                <w:iCs w:val="false"/>
+                <w:color w:val="222222"/>
+                <w:sz w:val="16"/>
+                <w:szCs w:val="16"/>
+              </w:rPr>
+              <w:t xml:space="preserve">Not Started</w:t>
             </w:r>
           </w:p>
         </w:tc>
@@ -3200,12 +4335,12 @@
       </w:tblPr>
       <w:tblGrid>
         <w:gridCol w:w="620"/>
-        <w:gridCol w:w="2500"/>
+        <w:gridCol w:w="2400"/>
         <w:gridCol w:w="1100"/>
         <w:gridCol w:w="780"/>
-        <w:gridCol w:w="1900"/>
-        <w:gridCol w:w="1766"/>
-        <w:gridCol w:w="1800"/>
+        <w:gridCol w:w="2000"/>
+        <w:gridCol w:w="1566"/>
+        <w:gridCol w:w="2000"/>
       </w:tblGrid>
       <w:tr>
         <w:trPr>
@@ -3252,7 +4387,7 @@
         </w:tc>
         <w:tc>
           <w:tcPr>
-            <w:tcW w:type="dxa" w:w="2500"/>
+            <w:tcW w:type="dxa" w:w="2400"/>
             <w:tcBorders>
               <w:top w:val="single" w:color="C5CDD6" w:sz="4"/>
               <w:left w:val="single" w:color="C5CDD6" w:sz="4"/>
@@ -3366,7 +4501,7 @@
         </w:tc>
         <w:tc>
           <w:tcPr>
-            <w:tcW w:type="dxa" w:w="1900"/>
+            <w:tcW w:type="dxa" w:w="2000"/>
             <w:tcBorders>
               <w:top w:val="single" w:color="C5CDD6" w:sz="4"/>
               <w:left w:val="single" w:color="C5CDD6" w:sz="4"/>
@@ -3404,7 +4539,7 @@
         </w:tc>
         <w:tc>
           <w:tcPr>
-            <w:tcW w:type="dxa" w:w="1766"/>
+            <w:tcW w:type="dxa" w:w="1566"/>
             <w:tcBorders>
               <w:top w:val="single" w:color="C5CDD6" w:sz="4"/>
               <w:left w:val="single" w:color="C5CDD6" w:sz="4"/>
@@ -3442,7 +4577,7 @@
         </w:tc>
         <w:tc>
           <w:tcPr>
-            <w:tcW w:type="dxa" w:w="1800"/>
+            <w:tcW w:type="dxa" w:w="2000"/>
             <w:tcBorders>
               <w:top w:val="single" w:color="C5CDD6" w:sz="4"/>
               <w:left w:val="single" w:color="C5CDD6" w:sz="4"/>
@@ -3474,7 +4609,7 @@
                 <w:sz w:val="15"/>
                 <w:szCs w:val="15"/>
               </w:rPr>
-              <w:t xml:space="preserve">Target</w:t>
+              <w:t xml:space="preserve">Target Completion Date</w:t>
             </w:r>
           </w:p>
         </w:tc>
@@ -3522,38 +4657,38 @@
         </w:tc>
         <w:tc>
           <w:tcPr>
-            <w:tcW w:type="dxa" w:w="2500"/>
-            <w:tcBorders>
-              <w:top w:val="single" w:color="C5CDD6" w:sz="4"/>
-              <w:left w:val="single" w:color="C5CDD6" w:sz="4"/>
-              <w:bottom w:val="single" w:color="C5CDD6" w:sz="4"/>
-              <w:right w:val="single" w:color="C5CDD6" w:sz="4"/>
-            </w:tcBorders>
-            <w:tcMar>
-              <w:top w:type="dxa" w:w="50"/>
-              <w:left w:type="dxa" w:w="60"/>
-              <w:bottom w:type="dxa" w:w="50"/>
-              <w:right w:type="dxa" w:w="60"/>
-            </w:tcMar>
-            <w:vAlign w:val="center"/>
-          </w:tcPr>
-          <w:p>
-            <w:pPr>
-              <w:spacing w:after="0" w:before="0"/>
-              <w:jc w:val="left"/>
-            </w:pPr>
-            <w:r>
-              <w:rPr>
-                <w:rFonts w:ascii="Calibri" w:cs="Calibri" w:eastAsia="Calibri" w:hAnsi="Calibri"/>
-                <w:b w:val="false"/>
-                <w:bCs w:val="false"/>
-                <w:i w:val="false"/>
-                <w:iCs w:val="false"/>
-                <w:color w:val="222222"/>
-                <w:sz w:val="16"/>
-                <w:szCs w:val="16"/>
-              </w:rPr>
-              <w:t xml:space="preserve">User Acceptance Testing of all four portals</w:t>
+            <w:tcW w:type="dxa" w:w="2400"/>
+            <w:tcBorders>
+              <w:top w:val="single" w:color="C5CDD6" w:sz="4"/>
+              <w:left w:val="single" w:color="C5CDD6" w:sz="4"/>
+              <w:bottom w:val="single" w:color="C5CDD6" w:sz="4"/>
+              <w:right w:val="single" w:color="C5CDD6" w:sz="4"/>
+            </w:tcBorders>
+            <w:tcMar>
+              <w:top w:type="dxa" w:w="50"/>
+              <w:left w:type="dxa" w:w="60"/>
+              <w:bottom w:type="dxa" w:w="50"/>
+              <w:right w:type="dxa" w:w="60"/>
+            </w:tcMar>
+            <w:vAlign w:val="center"/>
+          </w:tcPr>
+          <w:p>
+            <w:pPr>
+              <w:spacing w:after="0" w:before="0"/>
+              <w:jc w:val="left"/>
+            </w:pPr>
+            <w:r>
+              <w:rPr>
+                <w:rFonts w:ascii="Calibri" w:cs="Calibri" w:eastAsia="Calibri" w:hAnsi="Calibri"/>
+                <w:b w:val="false"/>
+                <w:bCs w:val="false"/>
+                <w:i w:val="false"/>
+                <w:iCs w:val="false"/>
+                <w:color w:val="222222"/>
+                <w:sz w:val="16"/>
+                <w:szCs w:val="16"/>
+              </w:rPr>
+              <w:t xml:space="preserve">User Acceptance Testing of Super Admin, Admin, Records, and Staff</w:t>
             </w:r>
           </w:p>
         </w:tc>
@@ -3633,7 +4768,7 @@
         </w:tc>
         <w:tc>
           <w:tcPr>
-            <w:tcW w:type="dxa" w:w="1900"/>
+            <w:tcW w:type="dxa" w:w="2000"/>
             <w:tcBorders>
               <w:top w:val="single" w:color="C5CDD6" w:sz="4"/>
               <w:left w:val="single" w:color="C5CDD6" w:sz="4"/>
@@ -3670,44 +4805,44 @@
         </w:tc>
         <w:tc>
           <w:tcPr>
-            <w:tcW w:type="dxa" w:w="1766"/>
-            <w:tcBorders>
-              <w:top w:val="single" w:color="C5CDD6" w:sz="4"/>
-              <w:left w:val="single" w:color="C5CDD6" w:sz="4"/>
-              <w:bottom w:val="single" w:color="C5CDD6" w:sz="4"/>
-              <w:right w:val="single" w:color="C5CDD6" w:sz="4"/>
-            </w:tcBorders>
-            <w:tcMar>
-              <w:top w:type="dxa" w:w="50"/>
-              <w:left w:type="dxa" w:w="60"/>
-              <w:bottom w:type="dxa" w:w="50"/>
-              <w:right w:type="dxa" w:w="60"/>
-            </w:tcMar>
-            <w:vAlign w:val="center"/>
-          </w:tcPr>
-          <w:p>
-            <w:pPr>
-              <w:spacing w:after="0" w:before="0"/>
-              <w:jc w:val="left"/>
-            </w:pPr>
-            <w:r>
-              <w:rPr>
-                <w:rFonts w:ascii="Calibri" w:cs="Calibri" w:eastAsia="Calibri" w:hAnsi="Calibri"/>
-                <w:b w:val="false"/>
-                <w:bCs w:val="false"/>
-                <w:i w:val="false"/>
-                <w:iCs w:val="false"/>
-                <w:color w:val="222222"/>
-                <w:sz w:val="16"/>
-                <w:szCs w:val="16"/>
-              </w:rPr>
-              <w:t xml:space="preserve">Not started</w:t>
-            </w:r>
-          </w:p>
-        </w:tc>
-        <w:tc>
-          <w:tcPr>
-            <w:tcW w:type="dxa" w:w="1800"/>
+            <w:tcW w:type="dxa" w:w="1566"/>
+            <w:tcBorders>
+              <w:top w:val="single" w:color="C5CDD6" w:sz="4"/>
+              <w:left w:val="single" w:color="C5CDD6" w:sz="4"/>
+              <w:bottom w:val="single" w:color="C5CDD6" w:sz="4"/>
+              <w:right w:val="single" w:color="C5CDD6" w:sz="4"/>
+            </w:tcBorders>
+            <w:tcMar>
+              <w:top w:type="dxa" w:w="50"/>
+              <w:left w:type="dxa" w:w="60"/>
+              <w:bottom w:type="dxa" w:w="50"/>
+              <w:right w:type="dxa" w:w="60"/>
+            </w:tcMar>
+            <w:vAlign w:val="center"/>
+          </w:tcPr>
+          <w:p>
+            <w:pPr>
+              <w:spacing w:after="0" w:before="0"/>
+              <w:jc w:val="left"/>
+            </w:pPr>
+            <w:r>
+              <w:rPr>
+                <w:rFonts w:ascii="Calibri" w:cs="Calibri" w:eastAsia="Calibri" w:hAnsi="Calibri"/>
+                <w:b w:val="false"/>
+                <w:bCs w:val="false"/>
+                <w:i w:val="false"/>
+                <w:iCs w:val="false"/>
+                <w:color w:val="222222"/>
+                <w:sz w:val="16"/>
+                <w:szCs w:val="16"/>
+              </w:rPr>
+              <w:t xml:space="preserve">Not Started</w:t>
+            </w:r>
+          </w:p>
+        </w:tc>
+        <w:tc>
+          <w:tcPr>
+            <w:tcW w:type="dxa" w:w="2000"/>
             <w:tcBorders>
               <w:top w:val="single" w:color="C5CDD6" w:sz="4"/>
               <w:left w:val="single" w:color="C5CDD6" w:sz="4"/>
@@ -3786,7 +4921,7 @@
         </w:tc>
         <w:tc>
           <w:tcPr>
-            <w:tcW w:type="dxa" w:w="2500"/>
+            <w:tcW w:type="dxa" w:w="2400"/>
             <w:tcBorders>
               <w:top w:val="single" w:color="C5CDD6" w:sz="4"/>
               <w:left w:val="single" w:color="C5CDD6" w:sz="4"/>
@@ -3897,7 +5032,7 @@
         </w:tc>
         <w:tc>
           <w:tcPr>
-            <w:tcW w:type="dxa" w:w="1900"/>
+            <w:tcW w:type="dxa" w:w="2000"/>
             <w:tcBorders>
               <w:top w:val="single" w:color="C5CDD6" w:sz="4"/>
               <w:left w:val="single" w:color="C5CDD6" w:sz="4"/>
@@ -3934,44 +5069,44 @@
         </w:tc>
         <w:tc>
           <w:tcPr>
-            <w:tcW w:type="dxa" w:w="1766"/>
-            <w:tcBorders>
-              <w:top w:val="single" w:color="C5CDD6" w:sz="4"/>
-              <w:left w:val="single" w:color="C5CDD6" w:sz="4"/>
-              <w:bottom w:val="single" w:color="C5CDD6" w:sz="4"/>
-              <w:right w:val="single" w:color="C5CDD6" w:sz="4"/>
-            </w:tcBorders>
-            <w:tcMar>
-              <w:top w:type="dxa" w:w="50"/>
-              <w:left w:type="dxa" w:w="60"/>
-              <w:bottom w:type="dxa" w:w="50"/>
-              <w:right w:type="dxa" w:w="60"/>
-            </w:tcMar>
-            <w:vAlign w:val="center"/>
-          </w:tcPr>
-          <w:p>
-            <w:pPr>
-              <w:spacing w:after="0" w:before="0"/>
-              <w:jc w:val="left"/>
-            </w:pPr>
-            <w:r>
-              <w:rPr>
-                <w:rFonts w:ascii="Calibri" w:cs="Calibri" w:eastAsia="Calibri" w:hAnsi="Calibri"/>
-                <w:b w:val="false"/>
-                <w:bCs w:val="false"/>
-                <w:i w:val="false"/>
-                <w:iCs w:val="false"/>
-                <w:color w:val="222222"/>
-                <w:sz w:val="16"/>
-                <w:szCs w:val="16"/>
-              </w:rPr>
-              <w:t xml:space="preserve">Not started</w:t>
-            </w:r>
-          </w:p>
-        </w:tc>
-        <w:tc>
-          <w:tcPr>
-            <w:tcW w:type="dxa" w:w="1800"/>
+            <w:tcW w:type="dxa" w:w="1566"/>
+            <w:tcBorders>
+              <w:top w:val="single" w:color="C5CDD6" w:sz="4"/>
+              <w:left w:val="single" w:color="C5CDD6" w:sz="4"/>
+              <w:bottom w:val="single" w:color="C5CDD6" w:sz="4"/>
+              <w:right w:val="single" w:color="C5CDD6" w:sz="4"/>
+            </w:tcBorders>
+            <w:tcMar>
+              <w:top w:type="dxa" w:w="50"/>
+              <w:left w:type="dxa" w:w="60"/>
+              <w:bottom w:type="dxa" w:w="50"/>
+              <w:right w:type="dxa" w:w="60"/>
+            </w:tcMar>
+            <w:vAlign w:val="center"/>
+          </w:tcPr>
+          <w:p>
+            <w:pPr>
+              <w:spacing w:after="0" w:before="0"/>
+              <w:jc w:val="left"/>
+            </w:pPr>
+            <w:r>
+              <w:rPr>
+                <w:rFonts w:ascii="Calibri" w:cs="Calibri" w:eastAsia="Calibri" w:hAnsi="Calibri"/>
+                <w:b w:val="false"/>
+                <w:bCs w:val="false"/>
+                <w:i w:val="false"/>
+                <w:iCs w:val="false"/>
+                <w:color w:val="222222"/>
+                <w:sz w:val="16"/>
+                <w:szCs w:val="16"/>
+              </w:rPr>
+              <w:t xml:space="preserve">Not Started</w:t>
+            </w:r>
+          </w:p>
+        </w:tc>
+        <w:tc>
+          <w:tcPr>
+            <w:tcW w:type="dxa" w:w="2000"/>
             <w:tcBorders>
               <w:top w:val="single" w:color="C5CDD6" w:sz="4"/>
               <w:left w:val="single" w:color="C5CDD6" w:sz="4"/>
@@ -4050,38 +5185,38 @@
         </w:tc>
         <w:tc>
           <w:tcPr>
-            <w:tcW w:type="dxa" w:w="2500"/>
-            <w:tcBorders>
-              <w:top w:val="single" w:color="C5CDD6" w:sz="4"/>
-              <w:left w:val="single" w:color="C5CDD6" w:sz="4"/>
-              <w:bottom w:val="single" w:color="C5CDD6" w:sz="4"/>
-              <w:right w:val="single" w:color="C5CDD6" w:sz="4"/>
-            </w:tcBorders>
-            <w:tcMar>
-              <w:top w:type="dxa" w:w="50"/>
-              <w:left w:type="dxa" w:w="60"/>
-              <w:bottom w:type="dxa" w:w="50"/>
-              <w:right w:type="dxa" w:w="60"/>
-            </w:tcMar>
-            <w:vAlign w:val="center"/>
-          </w:tcPr>
-          <w:p>
-            <w:pPr>
-              <w:spacing w:after="0" w:before="0"/>
-              <w:jc w:val="left"/>
-            </w:pPr>
-            <w:r>
-              <w:rPr>
-                <w:rFonts w:ascii="Calibri" w:cs="Calibri" w:eastAsia="Calibri" w:hAnsi="Calibri"/>
-                <w:b w:val="false"/>
-                <w:bCs w:val="false"/>
-                <w:i w:val="false"/>
-                <w:iCs w:val="false"/>
-                <w:color w:val="222222"/>
-                <w:sz w:val="16"/>
-                <w:szCs w:val="16"/>
-              </w:rPr>
-              <w:t xml:space="preserve">Acceptance of UAT findings, if any, and official go-live</w:t>
+            <w:tcW w:type="dxa" w:w="2400"/>
+            <w:tcBorders>
+              <w:top w:val="single" w:color="C5CDD6" w:sz="4"/>
+              <w:left w:val="single" w:color="C5CDD6" w:sz="4"/>
+              <w:bottom w:val="single" w:color="C5CDD6" w:sz="4"/>
+              <w:right w:val="single" w:color="C5CDD6" w:sz="4"/>
+            </w:tcBorders>
+            <w:tcMar>
+              <w:top w:type="dxa" w:w="50"/>
+              <w:left w:type="dxa" w:w="60"/>
+              <w:bottom w:type="dxa" w:w="50"/>
+              <w:right w:type="dxa" w:w="60"/>
+            </w:tcMar>
+            <w:vAlign w:val="center"/>
+          </w:tcPr>
+          <w:p>
+            <w:pPr>
+              <w:spacing w:after="0" w:before="0"/>
+              <w:jc w:val="left"/>
+            </w:pPr>
+            <w:r>
+              <w:rPr>
+                <w:rFonts w:ascii="Calibri" w:cs="Calibri" w:eastAsia="Calibri" w:hAnsi="Calibri"/>
+                <w:b w:val="false"/>
+                <w:bCs w:val="false"/>
+                <w:i w:val="false"/>
+                <w:iCs w:val="false"/>
+                <w:color w:val="222222"/>
+                <w:sz w:val="16"/>
+                <w:szCs w:val="16"/>
+              </w:rPr>
+              <w:t xml:space="preserve">Official go-live</w:t>
             </w:r>
           </w:p>
         </w:tc>
@@ -4161,7 +5296,7 @@
         </w:tc>
         <w:tc>
           <w:tcPr>
-            <w:tcW w:type="dxa" w:w="1900"/>
+            <w:tcW w:type="dxa" w:w="2000"/>
             <w:tcBorders>
               <w:top w:val="single" w:color="C5CDD6" w:sz="4"/>
               <w:left w:val="single" w:color="C5CDD6" w:sz="4"/>
@@ -4198,44 +5333,44 @@
         </w:tc>
         <w:tc>
           <w:tcPr>
-            <w:tcW w:type="dxa" w:w="1766"/>
-            <w:tcBorders>
-              <w:top w:val="single" w:color="C5CDD6" w:sz="4"/>
-              <w:left w:val="single" w:color="C5CDD6" w:sz="4"/>
-              <w:bottom w:val="single" w:color="C5CDD6" w:sz="4"/>
-              <w:right w:val="single" w:color="C5CDD6" w:sz="4"/>
-            </w:tcBorders>
-            <w:tcMar>
-              <w:top w:type="dxa" w:w="50"/>
-              <w:left w:type="dxa" w:w="60"/>
-              <w:bottom w:type="dxa" w:w="50"/>
-              <w:right w:type="dxa" w:w="60"/>
-            </w:tcMar>
-            <w:vAlign w:val="center"/>
-          </w:tcPr>
-          <w:p>
-            <w:pPr>
-              <w:spacing w:after="0" w:before="0"/>
-              <w:jc w:val="left"/>
-            </w:pPr>
-            <w:r>
-              <w:rPr>
-                <w:rFonts w:ascii="Calibri" w:cs="Calibri" w:eastAsia="Calibri" w:hAnsi="Calibri"/>
-                <w:b w:val="false"/>
-                <w:bCs w:val="false"/>
-                <w:i w:val="false"/>
-                <w:iCs w:val="false"/>
-                <w:color w:val="222222"/>
-                <w:sz w:val="16"/>
-                <w:szCs w:val="16"/>
-              </w:rPr>
-              <w:t xml:space="preserve">Not started</w:t>
-            </w:r>
-          </w:p>
-        </w:tc>
-        <w:tc>
-          <w:tcPr>
-            <w:tcW w:type="dxa" w:w="1800"/>
+            <w:tcW w:type="dxa" w:w="1566"/>
+            <w:tcBorders>
+              <w:top w:val="single" w:color="C5CDD6" w:sz="4"/>
+              <w:left w:val="single" w:color="C5CDD6" w:sz="4"/>
+              <w:bottom w:val="single" w:color="C5CDD6" w:sz="4"/>
+              <w:right w:val="single" w:color="C5CDD6" w:sz="4"/>
+            </w:tcBorders>
+            <w:tcMar>
+              <w:top w:type="dxa" w:w="50"/>
+              <w:left w:type="dxa" w:w="60"/>
+              <w:bottom w:type="dxa" w:w="50"/>
+              <w:right w:type="dxa" w:w="60"/>
+            </w:tcMar>
+            <w:vAlign w:val="center"/>
+          </w:tcPr>
+          <w:p>
+            <w:pPr>
+              <w:spacing w:after="0" w:before="0"/>
+              <w:jc w:val="left"/>
+            </w:pPr>
+            <w:r>
+              <w:rPr>
+                <w:rFonts w:ascii="Calibri" w:cs="Calibri" w:eastAsia="Calibri" w:hAnsi="Calibri"/>
+                <w:b w:val="false"/>
+                <w:bCs w:val="false"/>
+                <w:i w:val="false"/>
+                <w:iCs w:val="false"/>
+                <w:color w:val="222222"/>
+                <w:sz w:val="16"/>
+                <w:szCs w:val="16"/>
+              </w:rPr>
+              <w:t xml:space="preserve">Not Started</w:t>
+            </w:r>
+          </w:p>
+        </w:tc>
+        <w:tc>
+          <w:tcPr>
+            <w:tcW w:type="dxa" w:w="2000"/>
             <w:tcBorders>
               <w:top w:val="single" w:color="C5CDD6" w:sz="4"/>
               <w:left w:val="single" w:color="C5CDD6" w:sz="4"/>
@@ -4290,7 +5425,7 @@
           <w:sz w:val="24"/>
           <w:szCs w:val="24"/>
         </w:rPr>
-        <w:t xml:space="preserve">Development Progress</w:t>
+        <w:t xml:space="preserve">Development Progress Details</w:t>
       </w:r>
     </w:p>
     <w:p>
@@ -4308,7 +5443,7 @@
           <w:sz w:val="22"/>
           <w:szCs w:val="22"/>
         </w:rPr>
-        <w:t xml:space="preserve">As of 23 September 2026, development of the Support Ticketing System is complete and available for acceptance testing. The delivered scope is as follows.</w:t>
+        <w:t xml:space="preserve">As of 23 September 2026, development stands complete. The project opened on 15 May 2026 as the Technical Assistance Request System. In June the application was rebuilt as a full system with Admin, Records, and Client portals, including form building, approvals, assignment, printable forms, and client feedback. In July, real-time messaging and the shared dashboard and Settings layout were added.</w:t>
       </w:r>
     </w:p>
     <w:p>
@@ -4326,7 +5461,7 @@
           <w:sz w:val="22"/>
           <w:szCs w:val="22"/>
         </w:rPr>
-        <w:t xml:space="preserve">Super Admin manages users, roles, and permissions, and can open the Admin, Records, and Staff portals from one account. Admin builds any request form that fits the Form Builder, submits it to Records, approves requests, and assigns personnel. Records reviews pending forms and either approves and publishes them or disapproves them with remarks. Staff submit requests on published forms, take part in For Review when a form requires a Recommending Officer, Immediate Supervisor, or Action Officer, and close the request after service feedback.</w:t>
+        <w:t xml:space="preserve">In August the system was moved to Laravel and MySQL. In September, requestor details were connected to PAMANA, the Super Admin portal and role-based access were added, and the client review path was completed for Recommending Officer, Immediate Supervisor, and Action Officer, together with Assigned to me. The Employee User Manual, Version 2.3, was issued on 22 September 2026.</w:t>
       </w:r>
     </w:p>
     <w:p>
@@ -4344,7 +5479,7 @@
           <w:sz w:val="22"/>
           <w:szCs w:val="22"/>
         </w:rPr>
-        <w:t xml:space="preserve">Requestor name, division, and related profile details fill in from PAMANA. The Employee User Manual, Version 2.3, dated 22 September 2026, is the reference for UAT and training. It covers sign-in, Form Builder, My Forms, Pending Forms, Published Forms, Approvals, Request Management, Assigned to me, For Review, Submit Request, My Requests, Service Feedback, Messages, Reports, and Settings.</w:t>
+        <w:t xml:space="preserve">Admin builds a form and sends it to Records. Records approves and publishes the form, or disapproves it with remarks. Staff submit a request on any published form. Where the form requires it, the request passes through For Review, then Admin approval and assignment. The requestor confirms the service, submits feedback, and closes the ticket. The delivered system is ready for User Acceptance Testing.</w:t>
       </w:r>
     </w:p>
     <w:p>
@@ -4365,7 +5500,7 @@
           <w:sz w:val="24"/>
           <w:szCs w:val="24"/>
         </w:rPr>
-        <w:t xml:space="preserve">Requested from NMP</w:t>
+        <w:t xml:space="preserve">Requested Documents and Pending Deliverables</w:t>
       </w:r>
     </w:p>
     <w:p>
@@ -4383,7 +5518,7 @@
           <w:sz w:val="22"/>
           <w:szCs w:val="22"/>
         </w:rPr>
-        <w:t xml:space="preserve">The items below are needed so User Acceptance Testing can start on 24 September 2026 and the 6 October 2026 go-live date can hold.</w:t>
+        <w:t xml:space="preserve">The following items are requested from NMP so User Acceptance Testing can start on 24 September 2026 and the 6 October 2026 go-live date can be kept.</w:t>
       </w:r>
     </w:p>
     <w:tbl>
@@ -4482,7 +5617,7 @@
                 <w:sz w:val="15"/>
                 <w:szCs w:val="15"/>
               </w:rPr>
-              <w:t xml:space="preserve">Requested item</w:t>
+              <w:t xml:space="preserve">Requested Document</w:t>
             </w:r>
           </w:p>
         </w:tc>
@@ -4558,7 +5693,7 @@
                 <w:sz w:val="15"/>
                 <w:szCs w:val="15"/>
               </w:rPr>
-              <w:t xml:space="preserve">Date requested</w:t>
+              <w:t xml:space="preserve">Date Requested</w:t>
             </w:r>
           </w:p>
         </w:tc>

</xml_diff>

<commit_message>
Remove the employee user manuals from the repository.
Co-authored-by: Cursor <cursoragent@cursor.com>
</commit_message>
<xml_diff>
--- a/docs/NMP_Support_Ticketing_System_Progress_Report_23_September_2026.docx
+++ b/docs/NMP_Support_Ticketing_System_Progress_Report_23_September_2026.docx
@@ -785,7 +785,7 @@
           <w:sz w:val="24"/>
           <w:szCs w:val="24"/>
         </w:rPr>
-        <w:t xml:space="preserve">We are pleased to submit the official progress report for the Support Ticketing System (STS) project. Significant milestones have been achieved, including the successful completion of the core modules and the official deployment of the system on September 10, 2026.</w:t>
+        <w:t xml:space="preserve">We are pleased to submit the official progress report for the Support Ticketing System (STS) project. Significant milestones have been achieved, including the successful completion of the core modules and the official deployment of the system on-premises on September 15, 2026.</w:t>
       </w:r>
     </w:p>
     <w:p>
@@ -1597,7 +1597,7 @@
                 <w:sz w:val="20"/>
                 <w:szCs w:val="20"/>
               </w:rPr>
-              <w:t xml:space="preserve">Migration to Laravel and MySQL</w:t>
+              <w:t xml:space="preserve">Migration to Laravel and MySQL, keeping messaging, PDF generation, and requester details working</w:t>
             </w:r>
           </w:p>
         </w:tc>
@@ -1676,7 +1676,7 @@
                 <w:sz w:val="20"/>
                 <w:szCs w:val="20"/>
               </w:rPr>
-              <w:t xml:space="preserve">September 2026</w:t>
+              <w:t xml:space="preserve">September 10, 2026</w:t>
             </w:r>
           </w:p>
         </w:tc>
@@ -1713,7 +1713,7 @@
                 <w:sz w:val="20"/>
                 <w:szCs w:val="20"/>
               </w:rPr>
-              <w:t xml:space="preserve">Crafting of the Employee User Manual</w:t>
+              <w:t xml:space="preserve">Super Admin portal, PAMANA requestor autofill, and assignment limited to the form owner's division</w:t>
             </w:r>
           </w:p>
         </w:tc>
@@ -1792,7 +1792,7 @@
                 <w:sz w:val="20"/>
                 <w:szCs w:val="20"/>
               </w:rPr>
-              <w:t xml:space="preserve">September 10, 2026</w:t>
+              <w:t xml:space="preserve">September 15, 2026</w:t>
             </w:r>
           </w:p>
         </w:tc>
@@ -1829,7 +1829,7 @@
                 <w:sz w:val="20"/>
                 <w:szCs w:val="20"/>
               </w:rPr>
-              <w:t xml:space="preserve">Official system deployment</w:t>
+              <w:t xml:space="preserve">Official system deployment on-premises</w:t>
             </w:r>
           </w:p>
         </w:tc>
@@ -1923,7 +1923,7 @@
           <w:sz w:val="24"/>
           <w:szCs w:val="24"/>
         </w:rPr>
-        <w:t xml:space="preserve">Additional Features: PAMANA employee autofill, print-template field placement, client approval for Recommending Officer, Immediate Supervisor, and Action Officer, role-based access, and the Employee User Manual (Version 2.3).</w:t>
+        <w:t xml:space="preserve">Additional Features: PAMANA employee autofill, print-template field placement, client approval for Recommending Officer, Immediate Supervisor, and Action Officer, and role-based access.</w:t>
       </w:r>
     </w:p>
     <w:p>
@@ -2138,7 +2138,7 @@
           <w:sz w:val="24"/>
           <w:szCs w:val="24"/>
         </w:rPr>
-        <w:t xml:space="preserve">System Deployment: The Support Ticketing System was successfully deployed on September 10, 2026, and is now accessible at http://on-prem.x-dcb.net:5173.</w:t>
+        <w:t xml:space="preserve">System Deployment: The Support Ticketing System was successfully deployed on-premises on September 15, 2026, and is now accessible at http://on-prem.x-dcb.net:5173.</w:t>
       </w:r>
     </w:p>
     <w:p>

</xml_diff>